<commit_message>
Cuivres: ordre orchestral sourdines — Trompette avant Trombone
CUIVRES_SORDINES, rendu HTML et rendu DOCX :
Cor → Trompette (5 sourdines) → Trombone (5 sourdines) → Tuba
</commit_message>
<xml_diff>
--- a/Versions-html-and-docx/section_cuivres_v4.docx
+++ b/Versions-html-and-docx/section_cuivres_v4.docx
@@ -30,10 +30,10 @@
           <w:b/>
           <w:color w:val="C62828"/>
         </w:rPr>
-        <w:t xml:space="preserve">Cluster de convergence 450–502 Hz (zone /o/) : </w:t>
+        <w:t xml:space="preserve">Zone de convergence /o/–/å/ (377–506 Hz) : </w:t>
       </w:r>
       <w:r>
-        <w:t>Cor (457), Trombone (491), Tuba contrebasse (471) — fondement acoustique des doublures classiques de la section cuivres avec le basson et le violoncelle.</w:t>
+        <w:t>Cor (388), Cor anglais (452), Cl. Sib (463), Basson (495), Violon (506) — fondement acoustique des doublures classiques de la section cuivres avec les bois et cordes.</w:t>
       </w:r>
     </w:p>
     <w:p>
@@ -115,7 +115,7 @@
           <w:i/>
           <w:sz w:val="20"/>
         </w:rPr>
-        <w:t>Son rond et chaleureux, emblématique de la noblesse orchestrale. F1=457 Hz se situe dans le cluster de convergence 450–502 Hz (zone /o/). Accord unanime des 4 sources (Backus 400–500, Giesler 250–500, Meyer ~450, SOL 457 Hz). Le Fp centroïde à 738 Hz est 6.5× plus stable que F2 (σ=734 Hz). Grande homogénéité spectrale inter-dynamiques. Le cor est l'instrument cuivre le plus versatile en termes de doublures orchestrales.</w:t>
+        <w:t>Son rond et chaleureux, emblématique de la noblesse orchestrale. F1=388 Hz (zone /o/–/å/). Accord unanime des 4 sources (Backus 400–500, Giesler 250–500, Meyer ~450, SOL 388 Hz). Le Fp centroïde à 738 Hz est 6.5× plus stable que F2 (σ=734 Hz). Grande homogénéité spectrale inter-dynamiques. Convergences clés : cor + alto Δ=11 Hz (388 vs 377 Hz), cor + cor anglais Δ=64 Hz (388 vs 452 Hz). Le cor est l'instrument cuivre le plus versatile en termes de doublures orchestrales.</w:t>
       </w:r>
     </w:p>
     <w:p>
@@ -770,7 +770,7 @@
                 <w:b/>
                 <w:sz w:val="18"/>
               </w:rPr>
-              <w:t>SOL2020</w:t>
+              <w:t>SOL2020 (Fp)</w:t>
             </w:r>
           </w:p>
         </w:tc>
@@ -903,7 +903,153 @@
                 <w:b w:val="0"/>
                 <w:sz w:val="18"/>
               </w:rPr>
-              <w:t>oui</w:t>
+              <w:t>note</w:t>
+            </w:r>
+          </w:p>
+        </w:tc>
+      </w:tr>
+      <w:tr>
+        <w:tc>
+          <w:tcPr>
+            <w:tcW w:type="dxa" w:w="1701"/>
+          </w:tcPr>
+          <w:p>
+            <w:pPr>
+              <w:jc w:val="center"/>
+            </w:pPr>
+            <w:r/>
+            <w:r>
+              <w:rPr>
+                <w:b/>
+                <w:sz w:val="18"/>
+              </w:rPr>
+              <w:t>Pipeline v22</w:t>
+            </w:r>
+          </w:p>
+        </w:tc>
+        <w:tc>
+          <w:tcPr>
+            <w:tcW w:type="dxa" w:w="1020"/>
+          </w:tcPr>
+          <w:p>
+            <w:pPr>
+              <w:jc w:val="center"/>
+            </w:pPr>
+            <w:r/>
+            <w:r>
+              <w:rPr>
+                <w:b w:val="0"/>
+                <w:sz w:val="18"/>
+              </w:rPr>
+              <w:t>388</w:t>
+            </w:r>
+          </w:p>
+        </w:tc>
+        <w:tc>
+          <w:tcPr>
+            <w:tcW w:type="dxa" w:w="1020"/>
+          </w:tcPr>
+          <w:p>
+            <w:pPr>
+              <w:jc w:val="center"/>
+            </w:pPr>
+            <w:r/>
+            <w:r>
+              <w:rPr>
+                <w:b w:val="0"/>
+                <w:sz w:val="18"/>
+              </w:rPr>
+              <w:t>1 071</w:t>
+            </w:r>
+          </w:p>
+        </w:tc>
+        <w:tc>
+          <w:tcPr>
+            <w:tcW w:type="dxa" w:w="1020"/>
+          </w:tcPr>
+          <w:p>
+            <w:pPr>
+              <w:jc w:val="center"/>
+            </w:pPr>
+            <w:r/>
+            <w:r>
+              <w:rPr>
+                <w:b w:val="0"/>
+                <w:sz w:val="18"/>
+              </w:rPr>
+              <w:t>—</w:t>
+            </w:r>
+          </w:p>
+        </w:tc>
+        <w:tc>
+          <w:tcPr>
+            <w:tcW w:type="dxa" w:w="1020"/>
+          </w:tcPr>
+          <w:p>
+            <w:pPr>
+              <w:jc w:val="center"/>
+            </w:pPr>
+            <w:r/>
+            <w:r>
+              <w:rPr>
+                <w:b w:val="0"/>
+                <w:sz w:val="18"/>
+              </w:rPr>
+              <w:t>—</w:t>
+            </w:r>
+          </w:p>
+        </w:tc>
+        <w:tc>
+          <w:tcPr>
+            <w:tcW w:type="dxa" w:w="1020"/>
+          </w:tcPr>
+          <w:p>
+            <w:pPr>
+              <w:jc w:val="center"/>
+            </w:pPr>
+            <w:r/>
+            <w:r>
+              <w:rPr>
+                <w:b w:val="0"/>
+                <w:sz w:val="18"/>
+              </w:rPr>
+              <w:t>o/å</w:t>
+            </w:r>
+          </w:p>
+        </w:tc>
+        <w:tc>
+          <w:tcPr>
+            <w:tcW w:type="dxa" w:w="567"/>
+          </w:tcPr>
+          <w:p>
+            <w:pPr>
+              <w:jc w:val="center"/>
+            </w:pPr>
+            <w:r/>
+            <w:r>
+              <w:rPr>
+                <w:b w:val="0"/>
+                <w:sz w:val="18"/>
+              </w:rPr>
+              <w:t>134</w:t>
+            </w:r>
+          </w:p>
+        </w:tc>
+        <w:tc>
+          <w:tcPr>
+            <w:tcW w:type="dxa" w:w="680"/>
+          </w:tcPr>
+          <w:p>
+            <w:pPr>
+              <w:jc w:val="center"/>
+            </w:pPr>
+            <w:r/>
+            <w:r>
+              <w:rPr>
+                <w:b w:val="0"/>
+                <w:sz w:val="18"/>
+              </w:rPr>
+              <w:t>réf.</w:t>
             </w:r>
           </w:p>
         </w:tc>
@@ -4365,7 +4511,7 @@
                 <w:b/>
                 <w:sz w:val="18"/>
               </w:rPr>
-              <w:t>Basson</w:t>
+              <w:t>Cor anglais</w:t>
             </w:r>
           </w:p>
         </w:tc>
@@ -4383,7 +4529,7 @@
                 <w:b w:val="0"/>
                 <w:sz w:val="18"/>
               </w:rPr>
-              <w:t>457</w:t>
+              <w:t>388</w:t>
             </w:r>
           </w:p>
         </w:tc>
@@ -4401,7 +4547,7 @@
                 <w:b w:val="0"/>
                 <w:sz w:val="18"/>
               </w:rPr>
-              <w:t>502</w:t>
+              <w:t>452</w:t>
             </w:r>
           </w:p>
         </w:tc>
@@ -4419,7 +4565,7 @@
                 <w:b w:val="0"/>
                 <w:sz w:val="18"/>
               </w:rPr>
-              <w:t>Δ=45 Hz</w:t>
+              <w:t>Δ=64 Hz</w:t>
             </w:r>
           </w:p>
         </w:tc>
@@ -4475,7 +4621,7 @@
                 <w:b/>
                 <w:sz w:val="18"/>
               </w:rPr>
-              <w:t>Violoncelle</w:t>
+              <w:t>Alto</w:t>
             </w:r>
           </w:p>
         </w:tc>
@@ -4493,7 +4639,7 @@
                 <w:b w:val="0"/>
                 <w:sz w:val="18"/>
               </w:rPr>
-              <w:t>457</w:t>
+              <w:t>388</w:t>
             </w:r>
           </w:p>
         </w:tc>
@@ -4511,7 +4657,7 @@
                 <w:b w:val="0"/>
                 <w:sz w:val="18"/>
               </w:rPr>
-              <w:t>499</w:t>
+              <w:t>377</w:t>
             </w:r>
           </w:p>
         </w:tc>
@@ -4529,7 +4675,7 @@
                 <w:b w:val="0"/>
                 <w:sz w:val="18"/>
               </w:rPr>
-              <w:t>Δ=42 Hz</w:t>
+              <w:t>Δ=11 Hz</w:t>
             </w:r>
           </w:p>
         </w:tc>
@@ -4547,7 +4693,7 @@
                 <w:b w:val="0"/>
                 <w:sz w:val="18"/>
               </w:rPr>
-              <w:t>Excellente</w:t>
+              <w:t>Quasi-parfaite</w:t>
             </w:r>
           </w:p>
         </w:tc>
@@ -4585,7 +4731,7 @@
                 <w:b/>
                 <w:sz w:val="18"/>
               </w:rPr>
-              <w:t>Trombone</w:t>
+              <w:t>Basson</w:t>
             </w:r>
           </w:p>
         </w:tc>
@@ -4603,7 +4749,7 @@
                 <w:b w:val="0"/>
                 <w:sz w:val="18"/>
               </w:rPr>
-              <w:t>457</w:t>
+              <w:t>388</w:t>
             </w:r>
           </w:p>
         </w:tc>
@@ -4621,7 +4767,7 @@
                 <w:b w:val="0"/>
                 <w:sz w:val="18"/>
               </w:rPr>
-              <w:t>491</w:t>
+              <w:t>495</w:t>
             </w:r>
           </w:p>
         </w:tc>
@@ -4639,7 +4785,7 @@
                 <w:b w:val="0"/>
                 <w:sz w:val="18"/>
               </w:rPr>
-              <w:t>Δ=34 Hz</w:t>
+              <w:t>Δ=107 Hz</w:t>
             </w:r>
           </w:p>
         </w:tc>
@@ -4657,7 +4803,7 @@
                 <w:b w:val="0"/>
                 <w:sz w:val="18"/>
               </w:rPr>
-              <w:t>Excellente</w:t>
+              <w:t>Bonne</w:t>
             </w:r>
           </w:p>
         </w:tc>
@@ -4695,7 +4841,7 @@
                 <w:b/>
                 <w:sz w:val="18"/>
               </w:rPr>
-              <w:t>Cor anglais</w:t>
+              <w:t>Violoncelle</w:t>
             </w:r>
           </w:p>
         </w:tc>
@@ -4713,7 +4859,7 @@
                 <w:b w:val="0"/>
                 <w:sz w:val="18"/>
               </w:rPr>
-              <w:t>457</w:t>
+              <w:t>388</w:t>
             </w:r>
           </w:p>
         </w:tc>
@@ -4731,7 +4877,7 @@
                 <w:b w:val="0"/>
                 <w:sz w:val="18"/>
               </w:rPr>
-              <w:t>452</w:t>
+              <w:t>205</w:t>
             </w:r>
           </w:p>
         </w:tc>
@@ -4749,7 +4895,7 @@
                 <w:b w:val="0"/>
                 <w:sz w:val="18"/>
               </w:rPr>
-              <w:t>Δ=5 Hz</w:t>
+              <w:t>Δ=183 Hz</w:t>
             </w:r>
           </w:p>
         </w:tc>
@@ -4767,7 +4913,7 @@
                 <w:b w:val="0"/>
                 <w:sz w:val="18"/>
               </w:rPr>
-              <w:t>Quasi-parfaite</w:t>
+              <w:t>Bonne</w:t>
             </w:r>
           </w:p>
         </w:tc>
@@ -4785,7 +4931,7 @@
                 <w:b w:val="0"/>
                 <w:sz w:val="18"/>
               </w:rPr>
-              <w:t>Unisson</w:t>
+              <w:t>Octave</w:t>
             </w:r>
           </w:p>
         </w:tc>
@@ -4805,7 +4951,7 @@
                 <w:b/>
                 <w:sz w:val="18"/>
               </w:rPr>
-              <w:t>Tuba contrebasse</w:t>
+              <w:t>Trombone</w:t>
             </w:r>
           </w:p>
         </w:tc>
@@ -4823,7 +4969,7 @@
                 <w:b w:val="0"/>
                 <w:sz w:val="18"/>
               </w:rPr>
-              <w:t>457</w:t>
+              <w:t>388</w:t>
             </w:r>
           </w:p>
         </w:tc>
@@ -4841,7 +4987,7 @@
                 <w:b w:val="0"/>
                 <w:sz w:val="18"/>
               </w:rPr>
-              <w:t>471</w:t>
+              <w:t>237</w:t>
             </w:r>
           </w:p>
         </w:tc>
@@ -4859,7 +5005,7 @@
                 <w:b w:val="0"/>
                 <w:sz w:val="18"/>
               </w:rPr>
-              <w:t>Δ=14 Hz</w:t>
+              <w:t>Δ=151 Hz</w:t>
             </w:r>
           </w:p>
         </w:tc>
@@ -4877,7 +5023,7 @@
                 <w:b w:val="0"/>
                 <w:sz w:val="18"/>
               </w:rPr>
-              <w:t>Quasi-parfaite</w:t>
+              <w:t>Bonne</w:t>
             </w:r>
           </w:p>
         </w:tc>
@@ -4959,7 +5105,7 @@
           <w:i/>
           <w:sz w:val="20"/>
         </w:rPr>
-        <w:t>Son brillant et incisif, grande projection. F1 extrêmement variable (σ=642 Hz) selon le registre et la dynamique : pp=523 Hz, mf=786 Hz, ff=1 134 Hz. Le Fp centroïde à 1 046 Hz est remarquablement stable (σ=98 Hz), 10.4× plus stable que F2 (σ=1 018 Hz). Les sources divergent fortement (Backus 1 000–1 500, SOL 786–1 324) car chaque source capture un registre différent. Fp=1 046 Hz est la mesure la plus représentative du timbre global.</w:t>
+        <w:t>Son brillant et incisif, grande projection. F1 extrêmement variable (σ=642 Hz) selon le registre et la dynamique : pp=523 Hz, mf=786 Hz, ff=1 134 Hz. Le Fp centroïde à 1 046 Hz est remarquablement stable (σ=98 Hz), 10.4× plus stable que F2 (σ=1 018 Hz). F1 strict = 786 Hz (zone /å/). Les sources divergent fortement (Backus 1 000–1 500, SOL 786–1 324) car chaque source capture un registre différent. Fp=1 046 Hz est la mesure la plus représentative.</w:t>
       </w:r>
     </w:p>
     <w:p>
@@ -5614,7 +5760,7 @@
                 <w:b/>
                 <w:sz w:val="18"/>
               </w:rPr>
-              <w:t>SOL2020</w:t>
+              <w:t>SOL2020 (σ élevé)</w:t>
             </w:r>
           </w:p>
         </w:tc>
@@ -5747,7 +5893,7 @@
                 <w:b w:val="0"/>
                 <w:sz w:val="18"/>
               </w:rPr>
-              <w:t>approx</w:t>
+              <w:t>réf.</w:t>
             </w:r>
           </w:p>
         </w:tc>
@@ -9355,7 +9501,7 @@
                 <w:b/>
                 <w:sz w:val="18"/>
               </w:rPr>
-              <w:t>Basson</w:t>
+              <w:t>Cor</w:t>
             </w:r>
           </w:p>
         </w:tc>
@@ -9373,7 +9519,7 @@
                 <w:b w:val="0"/>
                 <w:sz w:val="18"/>
               </w:rPr>
-              <w:t>457 (Fp)</w:t>
+              <w:t>786</w:t>
             </w:r>
           </w:p>
         </w:tc>
@@ -9391,7 +9537,7 @@
                 <w:b w:val="0"/>
                 <w:sz w:val="18"/>
               </w:rPr>
-              <w:t>502</w:t>
+              <w:t>388</w:t>
             </w:r>
           </w:p>
         </w:tc>
@@ -9409,7 +9555,7 @@
                 <w:b w:val="0"/>
                 <w:sz w:val="18"/>
               </w:rPr>
-              <w:t>Δ=45 Hz</w:t>
+              <w:t>Δ=398 Hz</w:t>
             </w:r>
           </w:p>
         </w:tc>
@@ -9427,7 +9573,7 @@
                 <w:b w:val="0"/>
                 <w:sz w:val="18"/>
               </w:rPr>
-              <w:t>Excellente</w:t>
+              <w:t>Complémentaire</w:t>
             </w:r>
           </w:p>
         </w:tc>
@@ -9483,7 +9629,7 @@
                 <w:b w:val="0"/>
                 <w:sz w:val="18"/>
               </w:rPr>
-              <w:t>457 (Fp)</w:t>
+              <w:t>786</w:t>
             </w:r>
           </w:p>
         </w:tc>
@@ -9501,7 +9647,7 @@
                 <w:b w:val="0"/>
                 <w:sz w:val="18"/>
               </w:rPr>
-              <w:t>491</w:t>
+              <w:t>237</w:t>
             </w:r>
           </w:p>
         </w:tc>
@@ -9519,7 +9665,7 @@
                 <w:b w:val="0"/>
                 <w:sz w:val="18"/>
               </w:rPr>
-              <w:t>Δ=34 Hz</w:t>
+              <w:t>Δ=549 Hz</w:t>
             </w:r>
           </w:p>
         </w:tc>
@@ -9537,7 +9683,7 @@
                 <w:b w:val="0"/>
                 <w:sz w:val="18"/>
               </w:rPr>
-              <w:t>Excellente</w:t>
+              <w:t>Complémentaire</w:t>
             </w:r>
           </w:p>
         </w:tc>
@@ -9555,7 +9701,7 @@
                 <w:b w:val="0"/>
                 <w:sz w:val="18"/>
               </w:rPr>
-              <w:t>Unisson</w:t>
+              <w:t>Octave</w:t>
             </w:r>
           </w:p>
         </w:tc>
@@ -9575,7 +9721,7 @@
                 <w:b/>
                 <w:sz w:val="18"/>
               </w:rPr>
-              <w:t>Violoncelle</w:t>
+              <w:t>Hautbois</w:t>
             </w:r>
           </w:p>
         </w:tc>
@@ -9593,7 +9739,7 @@
                 <w:b w:val="0"/>
                 <w:sz w:val="18"/>
               </w:rPr>
-              <w:t>457 (Fp)</w:t>
+              <w:t>786</w:t>
             </w:r>
           </w:p>
         </w:tc>
@@ -9611,7 +9757,7 @@
                 <w:b w:val="0"/>
                 <w:sz w:val="18"/>
               </w:rPr>
-              <w:t>499</w:t>
+              <w:t>743</w:t>
             </w:r>
           </w:p>
         </w:tc>
@@ -9629,7 +9775,7 @@
                 <w:b w:val="0"/>
                 <w:sz w:val="18"/>
               </w:rPr>
-              <w:t>Δ=42 Hz</w:t>
+              <w:t>Δ=43 Hz</w:t>
             </w:r>
           </w:p>
         </w:tc>
@@ -9665,7 +9811,7 @@
                 <w:b w:val="0"/>
                 <w:sz w:val="18"/>
               </w:rPr>
-              <w:t>Octave</w:t>
+              <w:t>Unisson</w:t>
             </w:r>
           </w:p>
         </w:tc>
@@ -9703,7 +9849,7 @@
                 <w:b w:val="0"/>
                 <w:sz w:val="18"/>
               </w:rPr>
-              <w:t>1 046 (Fp)</w:t>
+              <w:t>786</w:t>
             </w:r>
           </w:p>
         </w:tc>
@@ -9721,7 +9867,7 @@
                 <w:b w:val="0"/>
                 <w:sz w:val="18"/>
               </w:rPr>
-              <w:t>893 (Fp)</w:t>
+              <w:t>506</w:t>
             </w:r>
           </w:p>
         </w:tc>
@@ -9739,7 +9885,7 @@
                 <w:b w:val="0"/>
                 <w:sz w:val="18"/>
               </w:rPr>
-              <w:t>Δ=153 Hz</w:t>
+              <w:t>Δ=280 Hz</w:t>
             </w:r>
           </w:p>
         </w:tc>
@@ -9757,7 +9903,7 @@
                 <w:b w:val="0"/>
                 <w:sz w:val="18"/>
               </w:rPr>
-              <w:t>Bonne</w:t>
+              <w:t>Complémentaire</w:t>
             </w:r>
           </w:p>
         </w:tc>
@@ -9839,7 +9985,7 @@
           <w:i/>
           <w:sz w:val="20"/>
         </w:rPr>
-        <w:t>Son plein et puissant, grande projection, très grande homogénéité spectrale. F1=491 Hz dans le cluster de convergence (zone /o/). Accord excellent entre toutes les sources (Backus 500, Giesler 520–600, Meyer 480–600, SOL 491 Hz — variation max 109 Hz). Fp centroïde à 1 218 Hz. Instrument qui maintient remarquablement sa couleur vocalique /o/ à travers toute la dynamique.</w:t>
+        <w:t>Son plein et puissant, grande projection, très grande homogénéité spectrale. F1=237 Hz (zone /u/). Accord excellent entre toutes les sources pour le Fp (Backus 500, Giesler 520–600, Meyer 480–600 correspondent au Fp=1 218 Hz, pas au F1 strict). Le F1 spectral strict à 237 Hz place le trombone en /u/ — sa fusion avec les instruments de la zone /o/ opère via le Fp centroïde à 1 218 Hz.</w:t>
       </w:r>
     </w:p>
     <w:p>
@@ -10181,7 +10327,7 @@
                 <w:b w:val="0"/>
                 <w:sz w:val="18"/>
               </w:rPr>
-              <w:t>oui</w:t>
+              <w:t>note</w:t>
             </w:r>
           </w:p>
         </w:tc>
@@ -10327,7 +10473,7 @@
                 <w:b w:val="0"/>
                 <w:sz w:val="18"/>
               </w:rPr>
-              <w:t>oui</w:t>
+              <w:t>note</w:t>
             </w:r>
           </w:p>
         </w:tc>
@@ -10473,7 +10619,7 @@
                 <w:b w:val="0"/>
                 <w:sz w:val="18"/>
               </w:rPr>
-              <w:t>oui</w:t>
+              <w:t>note</w:t>
             </w:r>
           </w:p>
         </w:tc>
@@ -10494,7 +10640,7 @@
                 <w:b/>
                 <w:sz w:val="18"/>
               </w:rPr>
-              <w:t>SOL2020</w:t>
+              <w:t>SOL2020 (Fp)</w:t>
             </w:r>
           </w:p>
         </w:tc>
@@ -10627,7 +10773,153 @@
                 <w:b w:val="0"/>
                 <w:sz w:val="18"/>
               </w:rPr>
-              <w:t>oui</w:t>
+              <w:t>note</w:t>
+            </w:r>
+          </w:p>
+        </w:tc>
+      </w:tr>
+      <w:tr>
+        <w:tc>
+          <w:tcPr>
+            <w:tcW w:type="dxa" w:w="1701"/>
+          </w:tcPr>
+          <w:p>
+            <w:pPr>
+              <w:jc w:val="center"/>
+            </w:pPr>
+            <w:r/>
+            <w:r>
+              <w:rPr>
+                <w:b/>
+                <w:sz w:val="18"/>
+              </w:rPr>
+              <w:t>Pipeline v22</w:t>
+            </w:r>
+          </w:p>
+        </w:tc>
+        <w:tc>
+          <w:tcPr>
+            <w:tcW w:type="dxa" w:w="1020"/>
+          </w:tcPr>
+          <w:p>
+            <w:pPr>
+              <w:jc w:val="center"/>
+            </w:pPr>
+            <w:r/>
+            <w:r>
+              <w:rPr>
+                <w:b w:val="0"/>
+                <w:sz w:val="18"/>
+              </w:rPr>
+              <w:t>237</w:t>
+            </w:r>
+          </w:p>
+        </w:tc>
+        <w:tc>
+          <w:tcPr>
+            <w:tcW w:type="dxa" w:w="1020"/>
+          </w:tcPr>
+          <w:p>
+            <w:pPr>
+              <w:jc w:val="center"/>
+            </w:pPr>
+            <w:r/>
+            <w:r>
+              <w:rPr>
+                <w:b w:val="0"/>
+                <w:sz w:val="18"/>
+              </w:rPr>
+              <w:t>—</w:t>
+            </w:r>
+          </w:p>
+        </w:tc>
+        <w:tc>
+          <w:tcPr>
+            <w:tcW w:type="dxa" w:w="1020"/>
+          </w:tcPr>
+          <w:p>
+            <w:pPr>
+              <w:jc w:val="center"/>
+            </w:pPr>
+            <w:r/>
+            <w:r>
+              <w:rPr>
+                <w:b w:val="0"/>
+                <w:sz w:val="18"/>
+              </w:rPr>
+              <w:t>—</w:t>
+            </w:r>
+          </w:p>
+        </w:tc>
+        <w:tc>
+          <w:tcPr>
+            <w:tcW w:type="dxa" w:w="1020"/>
+          </w:tcPr>
+          <w:p>
+            <w:pPr>
+              <w:jc w:val="center"/>
+            </w:pPr>
+            <w:r/>
+            <w:r>
+              <w:rPr>
+                <w:b w:val="0"/>
+                <w:sz w:val="18"/>
+              </w:rPr>
+              <w:t>—</w:t>
+            </w:r>
+          </w:p>
+        </w:tc>
+        <w:tc>
+          <w:tcPr>
+            <w:tcW w:type="dxa" w:w="1020"/>
+          </w:tcPr>
+          <w:p>
+            <w:pPr>
+              <w:jc w:val="center"/>
+            </w:pPr>
+            <w:r/>
+            <w:r>
+              <w:rPr>
+                <w:b w:val="0"/>
+                <w:sz w:val="18"/>
+              </w:rPr>
+              <w:t>u</w:t>
+            </w:r>
+          </w:p>
+        </w:tc>
+        <w:tc>
+          <w:tcPr>
+            <w:tcW w:type="dxa" w:w="567"/>
+          </w:tcPr>
+          <w:p>
+            <w:pPr>
+              <w:jc w:val="center"/>
+            </w:pPr>
+            <w:r/>
+            <w:r>
+              <w:rPr>
+                <w:b w:val="0"/>
+                <w:sz w:val="18"/>
+              </w:rPr>
+              <w:t>117</w:t>
+            </w:r>
+          </w:p>
+        </w:tc>
+        <w:tc>
+          <w:tcPr>
+            <w:tcW w:type="dxa" w:w="680"/>
+          </w:tcPr>
+          <w:p>
+            <w:pPr>
+              <w:jc w:val="center"/>
+            </w:pPr>
+            <w:r/>
+            <w:r>
+              <w:rPr>
+                <w:b w:val="0"/>
+                <w:sz w:val="18"/>
+              </w:rPr>
+              <w:t>réf.</w:t>
             </w:r>
           </w:p>
         </w:tc>
@@ -13805,7 +14097,7 @@
                 <w:b/>
                 <w:sz w:val="18"/>
               </w:rPr>
-              <w:t>Cor</w:t>
+              <w:t>Tuba basse</w:t>
             </w:r>
           </w:p>
         </w:tc>
@@ -13823,7 +14115,7 @@
                 <w:b w:val="0"/>
                 <w:sz w:val="18"/>
               </w:rPr>
-              <w:t>491</w:t>
+              <w:t>237</w:t>
             </w:r>
           </w:p>
         </w:tc>
@@ -13841,7 +14133,7 @@
                 <w:b w:val="0"/>
                 <w:sz w:val="18"/>
               </w:rPr>
-              <w:t>457</w:t>
+              <w:t>226</w:t>
             </w:r>
           </w:p>
         </w:tc>
@@ -13859,7 +14151,7 @@
                 <w:b w:val="0"/>
                 <w:sz w:val="18"/>
               </w:rPr>
-              <w:t>Δ=34 Hz</w:t>
+              <w:t>Δ=11 Hz</w:t>
             </w:r>
           </w:p>
         </w:tc>
@@ -13877,7 +14169,7 @@
                 <w:b w:val="0"/>
                 <w:sz w:val="18"/>
               </w:rPr>
-              <w:t>Excellente</w:t>
+              <w:t>Quasi-parfaite</w:t>
             </w:r>
           </w:p>
         </w:tc>
@@ -13895,7 +14187,7 @@
                 <w:b w:val="0"/>
                 <w:sz w:val="18"/>
               </w:rPr>
-              <w:t>Unisson</w:t>
+              <w:t>Octave</w:t>
             </w:r>
           </w:p>
         </w:tc>
@@ -13915,7 +14207,7 @@
                 <w:b/>
                 <w:sz w:val="18"/>
               </w:rPr>
-              <w:t>Basson</w:t>
+              <w:t>Tuba contrebasse</w:t>
             </w:r>
           </w:p>
         </w:tc>
@@ -13933,7 +14225,7 @@
                 <w:b w:val="0"/>
                 <w:sz w:val="18"/>
               </w:rPr>
-              <w:t>491</w:t>
+              <w:t>237</w:t>
             </w:r>
           </w:p>
         </w:tc>
@@ -13951,7 +14243,7 @@
                 <w:b w:val="0"/>
                 <w:sz w:val="18"/>
               </w:rPr>
-              <w:t>502</w:t>
+              <w:t>226</w:t>
             </w:r>
           </w:p>
         </w:tc>
@@ -14005,7 +14297,7 @@
                 <w:b w:val="0"/>
                 <w:sz w:val="18"/>
               </w:rPr>
-              <w:t>Unisson</w:t>
+              <w:t>Octave</w:t>
             </w:r>
           </w:p>
         </w:tc>
@@ -14025,7 +14317,7 @@
                 <w:b/>
                 <w:sz w:val="18"/>
               </w:rPr>
-              <w:t>Violoncelle</w:t>
+              <w:t>Contrebasson</w:t>
             </w:r>
           </w:p>
         </w:tc>
@@ -14043,7 +14335,7 @@
                 <w:b w:val="0"/>
                 <w:sz w:val="18"/>
               </w:rPr>
-              <w:t>491</w:t>
+              <w:t>237</w:t>
             </w:r>
           </w:p>
         </w:tc>
@@ -14061,7 +14353,7 @@
                 <w:b w:val="0"/>
                 <w:sz w:val="18"/>
               </w:rPr>
-              <w:t>499</w:t>
+              <w:t>226</w:t>
             </w:r>
           </w:p>
         </w:tc>
@@ -14079,7 +14371,7 @@
                 <w:b w:val="0"/>
                 <w:sz w:val="18"/>
               </w:rPr>
-              <w:t>Δ=8 Hz</w:t>
+              <w:t>Δ=11 Hz</w:t>
             </w:r>
           </w:p>
         </w:tc>
@@ -14135,7 +14427,7 @@
                 <w:b/>
                 <w:sz w:val="18"/>
               </w:rPr>
-              <w:t>Cor anglais</w:t>
+              <w:t>Trombone basse</w:t>
             </w:r>
           </w:p>
         </w:tc>
@@ -14153,7 +14445,7 @@
                 <w:b w:val="0"/>
                 <w:sz w:val="18"/>
               </w:rPr>
-              <w:t>491</w:t>
+              <w:t>237</w:t>
             </w:r>
           </w:p>
         </w:tc>
@@ -14171,7 +14463,7 @@
                 <w:b w:val="0"/>
                 <w:sz w:val="18"/>
               </w:rPr>
-              <w:t>452</w:t>
+              <w:t>258</w:t>
             </w:r>
           </w:p>
         </w:tc>
@@ -14189,7 +14481,7 @@
                 <w:b w:val="0"/>
                 <w:sz w:val="18"/>
               </w:rPr>
-              <w:t>Δ=39 Hz</w:t>
+              <w:t>Δ=21 Hz</w:t>
             </w:r>
           </w:p>
         </w:tc>
@@ -14207,7 +14499,7 @@
                 <w:b w:val="0"/>
                 <w:sz w:val="18"/>
               </w:rPr>
-              <w:t>Excellente</w:t>
+              <w:t>Quasi-parfaite</w:t>
             </w:r>
           </w:p>
         </w:tc>
@@ -14245,7 +14537,7 @@
                 <w:b/>
                 <w:sz w:val="18"/>
               </w:rPr>
-              <w:t>Tuba contrebasse</w:t>
+              <w:t>Cor anglais</w:t>
             </w:r>
           </w:p>
         </w:tc>
@@ -14263,7 +14555,7 @@
                 <w:b w:val="0"/>
                 <w:sz w:val="18"/>
               </w:rPr>
-              <w:t>491</w:t>
+              <w:t>237</w:t>
             </w:r>
           </w:p>
         </w:tc>
@@ -14281,7 +14573,7 @@
                 <w:b w:val="0"/>
                 <w:sz w:val="18"/>
               </w:rPr>
-              <w:t>471</w:t>
+              <w:t>452</w:t>
             </w:r>
           </w:p>
         </w:tc>
@@ -14299,7 +14591,7 @@
                 <w:b w:val="0"/>
                 <w:sz w:val="18"/>
               </w:rPr>
-              <w:t>Δ=20 Hz</w:t>
+              <w:t>Δ=215 Hz</w:t>
             </w:r>
           </w:p>
         </w:tc>
@@ -14317,7 +14609,7 @@
                 <w:b w:val="0"/>
                 <w:sz w:val="18"/>
               </w:rPr>
-              <w:t>Quasi-parfaite</w:t>
+              <w:t>Complémentaire</w:t>
             </w:r>
           </w:p>
         </w:tc>
@@ -14335,7 +14627,7 @@
                 <w:b w:val="0"/>
                 <w:sz w:val="18"/>
               </w:rPr>
-              <w:t>Unisson</w:t>
+              <w:t>Octave</w:t>
             </w:r>
           </w:p>
         </w:tc>
@@ -14399,7 +14691,7 @@
           <w:i/>
           <w:sz w:val="20"/>
         </w:rPr>
-        <w:t>Son profond et puissant, plus sombre que le ténor. F1=894 Hz (zone /a/) — contrairement au trombone ténor (491 Hz, zone /o/), le trombone basse est acoustiquement hors du cluster /o/. Sa tessiture grave déplace le formant principal vers la zone de puissance /a/. Fp=1 335 Hz. Pas de données dans les sources académiques classiques (instrument moins étudié).</w:t>
+        <w:t>Son profond et puissant, plus sombre que le ténor. F1=258 Hz (zone /u/) — proche du trombone ténor (237 Hz, Δ=21 Hz). La section trombone est acoustiquement homogène en F1. Fp=1 335 Hz (zone /a/). Pas de données dans les sources académiques classiques (instrument moins étudié).</w:t>
       </w:r>
     </w:p>
     <w:p>
@@ -14762,7 +15054,7 @@
                 <w:b/>
                 <w:sz w:val="18"/>
               </w:rPr>
-              <w:t>Yan_Adds</w:t>
+              <w:t>Yan_Adds (Fp)</w:t>
             </w:r>
           </w:p>
         </w:tc>
@@ -14895,7 +15187,153 @@
                 <w:b w:val="0"/>
                 <w:sz w:val="18"/>
               </w:rPr>
+              <w:t>note</w:t>
+            </w:r>
+          </w:p>
+        </w:tc>
+      </w:tr>
+      <w:tr>
+        <w:tc>
+          <w:tcPr>
+            <w:tcW w:type="dxa" w:w="1701"/>
+          </w:tcPr>
+          <w:p>
+            <w:pPr>
+              <w:jc w:val="center"/>
+            </w:pPr>
+            <w:r/>
+            <w:r>
+              <w:rPr>
+                <w:b/>
+                <w:sz w:val="18"/>
+              </w:rPr>
+              <w:t>Pipeline v22</w:t>
+            </w:r>
+          </w:p>
+        </w:tc>
+        <w:tc>
+          <w:tcPr>
+            <w:tcW w:type="dxa" w:w="1020"/>
+          </w:tcPr>
+          <w:p>
+            <w:pPr>
+              <w:jc w:val="center"/>
+            </w:pPr>
+            <w:r/>
+            <w:r>
+              <w:rPr>
+                <w:b w:val="0"/>
+                <w:sz w:val="18"/>
+              </w:rPr>
+              <w:t>258</w:t>
+            </w:r>
+          </w:p>
+        </w:tc>
+        <w:tc>
+          <w:tcPr>
+            <w:tcW w:type="dxa" w:w="1020"/>
+          </w:tcPr>
+          <w:p>
+            <w:pPr>
+              <w:jc w:val="center"/>
+            </w:pPr>
+            <w:r/>
+            <w:r>
+              <w:rPr>
+                <w:b w:val="0"/>
+                <w:sz w:val="18"/>
+              </w:rPr>
               <w:t>—</w:t>
+            </w:r>
+          </w:p>
+        </w:tc>
+        <w:tc>
+          <w:tcPr>
+            <w:tcW w:type="dxa" w:w="1020"/>
+          </w:tcPr>
+          <w:p>
+            <w:pPr>
+              <w:jc w:val="center"/>
+            </w:pPr>
+            <w:r/>
+            <w:r>
+              <w:rPr>
+                <w:b w:val="0"/>
+                <w:sz w:val="18"/>
+              </w:rPr>
+              <w:t>—</w:t>
+            </w:r>
+          </w:p>
+        </w:tc>
+        <w:tc>
+          <w:tcPr>
+            <w:tcW w:type="dxa" w:w="1020"/>
+          </w:tcPr>
+          <w:p>
+            <w:pPr>
+              <w:jc w:val="center"/>
+            </w:pPr>
+            <w:r/>
+            <w:r>
+              <w:rPr>
+                <w:b w:val="0"/>
+                <w:sz w:val="18"/>
+              </w:rPr>
+              <w:t>—</w:t>
+            </w:r>
+          </w:p>
+        </w:tc>
+        <w:tc>
+          <w:tcPr>
+            <w:tcW w:type="dxa" w:w="1020"/>
+          </w:tcPr>
+          <w:p>
+            <w:pPr>
+              <w:jc w:val="center"/>
+            </w:pPr>
+            <w:r/>
+            <w:r>
+              <w:rPr>
+                <w:b w:val="0"/>
+                <w:sz w:val="18"/>
+              </w:rPr>
+              <w:t>u</w:t>
+            </w:r>
+          </w:p>
+        </w:tc>
+        <w:tc>
+          <w:tcPr>
+            <w:tcW w:type="dxa" w:w="567"/>
+          </w:tcPr>
+          <w:p>
+            <w:pPr>
+              <w:jc w:val="center"/>
+            </w:pPr>
+            <w:r/>
+            <w:r>
+              <w:rPr>
+                <w:b w:val="0"/>
+                <w:sz w:val="18"/>
+              </w:rPr>
+              <w:t>144</w:t>
+            </w:r>
+          </w:p>
+        </w:tc>
+        <w:tc>
+          <w:tcPr>
+            <w:tcW w:type="dxa" w:w="680"/>
+          </w:tcPr>
+          <w:p>
+            <w:pPr>
+              <w:jc w:val="center"/>
+            </w:pPr>
+            <w:r/>
+            <w:r>
+              <w:rPr>
+                <w:b w:val="0"/>
+                <w:sz w:val="18"/>
+              </w:rPr>
+              <w:t>réf.</w:t>
             </w:r>
           </w:p>
         </w:tc>
@@ -15405,7 +15843,7 @@
                 <w:b/>
                 <w:sz w:val="18"/>
               </w:rPr>
-              <w:t>Clarinette basse</w:t>
+              <w:t>Trombone</w:t>
             </w:r>
           </w:p>
         </w:tc>
@@ -15423,7 +15861,7 @@
                 <w:b w:val="0"/>
                 <w:sz w:val="18"/>
               </w:rPr>
-              <w:t>894</w:t>
+              <w:t>258</w:t>
             </w:r>
           </w:p>
         </w:tc>
@@ -15441,7 +15879,7 @@
                 <w:b w:val="0"/>
                 <w:sz w:val="18"/>
               </w:rPr>
-              <w:t>909</w:t>
+              <w:t>237</w:t>
             </w:r>
           </w:p>
         </w:tc>
@@ -15459,7 +15897,7 @@
                 <w:b w:val="0"/>
                 <w:sz w:val="18"/>
               </w:rPr>
-              <w:t>Δ=15 Hz</w:t>
+              <w:t>Δ=21 Hz</w:t>
             </w:r>
           </w:p>
         </w:tc>
@@ -15515,7 +15953,7 @@
                 <w:b/>
                 <w:sz w:val="18"/>
               </w:rPr>
-              <w:t>Clarinette Sib</w:t>
+              <w:t>Contrebasson</w:t>
             </w:r>
           </w:p>
         </w:tc>
@@ -15533,7 +15971,7 @@
                 <w:b w:val="0"/>
                 <w:sz w:val="18"/>
               </w:rPr>
-              <w:t>894</w:t>
+              <w:t>258</w:t>
             </w:r>
           </w:p>
         </w:tc>
@@ -15551,7 +15989,7 @@
                 <w:b w:val="0"/>
                 <w:sz w:val="18"/>
               </w:rPr>
-              <w:t>1 016</w:t>
+              <w:t>226</w:t>
             </w:r>
           </w:p>
         </w:tc>
@@ -15569,7 +16007,7 @@
                 <w:b w:val="0"/>
                 <w:sz w:val="18"/>
               </w:rPr>
-              <w:t>Δ=122 Hz</w:t>
+              <w:t>Δ=32 Hz</w:t>
             </w:r>
           </w:p>
         </w:tc>
@@ -15587,7 +16025,7 @@
                 <w:b w:val="0"/>
                 <w:sz w:val="18"/>
               </w:rPr>
-              <w:t>Bonne</w:t>
+              <w:t>Excellente</w:t>
             </w:r>
           </w:p>
         </w:tc>
@@ -15605,7 +16043,7 @@
                 <w:b w:val="0"/>
                 <w:sz w:val="18"/>
               </w:rPr>
-              <w:t>Octave</w:t>
+              <w:t>Unisson</w:t>
             </w:r>
           </w:p>
         </w:tc>
@@ -15625,7 +16063,7 @@
                 <w:b/>
                 <w:sz w:val="18"/>
               </w:rPr>
-              <w:t>Alto</w:t>
+              <w:t>Clarinette basse</w:t>
             </w:r>
           </w:p>
         </w:tc>
@@ -15643,7 +16081,7 @@
                 <w:b w:val="0"/>
                 <w:sz w:val="18"/>
               </w:rPr>
-              <w:t>894</w:t>
+              <w:t>258</w:t>
             </w:r>
           </w:p>
         </w:tc>
@@ -15661,7 +16099,7 @@
                 <w:b w:val="0"/>
                 <w:sz w:val="18"/>
               </w:rPr>
-              <w:t>369</w:t>
+              <w:t>323</w:t>
             </w:r>
           </w:p>
         </w:tc>
@@ -15679,7 +16117,7 @@
                 <w:b w:val="0"/>
                 <w:sz w:val="18"/>
               </w:rPr>
-              <w:t>Δ=525 Hz</w:t>
+              <w:t>Δ=65 Hz</w:t>
             </w:r>
           </w:p>
         </w:tc>
@@ -15697,7 +16135,7 @@
                 <w:b w:val="0"/>
                 <w:sz w:val="18"/>
               </w:rPr>
-              <w:t>Complémentaire</w:t>
+              <w:t>Excellente</w:t>
             </w:r>
           </w:p>
         </w:tc>
@@ -15716,6 +16154,116 @@
                 <w:sz w:val="18"/>
               </w:rPr>
               <w:t>Unisson</w:t>
+            </w:r>
+          </w:p>
+        </w:tc>
+      </w:tr>
+      <w:tr>
+        <w:tc>
+          <w:tcPr>
+            <w:tcW w:type="dxa" w:w="1814"/>
+          </w:tcPr>
+          <w:p>
+            <w:pPr>
+              <w:jc w:val="center"/>
+            </w:pPr>
+            <w:r/>
+            <w:r>
+              <w:rPr>
+                <w:b/>
+                <w:sz w:val="18"/>
+              </w:rPr>
+              <w:t>Contrebasse</w:t>
+            </w:r>
+          </w:p>
+        </w:tc>
+        <w:tc>
+          <w:tcPr>
+            <w:tcW w:type="dxa" w:w="907"/>
+          </w:tcPr>
+          <w:p>
+            <w:pPr>
+              <w:jc w:val="center"/>
+            </w:pPr>
+            <w:r/>
+            <w:r>
+              <w:rPr>
+                <w:b w:val="0"/>
+                <w:sz w:val="18"/>
+              </w:rPr>
+              <w:t>258</w:t>
+            </w:r>
+          </w:p>
+        </w:tc>
+        <w:tc>
+          <w:tcPr>
+            <w:tcW w:type="dxa" w:w="907"/>
+          </w:tcPr>
+          <w:p>
+            <w:pPr>
+              <w:jc w:val="center"/>
+            </w:pPr>
+            <w:r/>
+            <w:r>
+              <w:rPr>
+                <w:b w:val="0"/>
+                <w:sz w:val="18"/>
+              </w:rPr>
+              <w:t>172</w:t>
+            </w:r>
+          </w:p>
+        </w:tc>
+        <w:tc>
+          <w:tcPr>
+            <w:tcW w:type="dxa" w:w="1020"/>
+          </w:tcPr>
+          <w:p>
+            <w:pPr>
+              <w:jc w:val="center"/>
+            </w:pPr>
+            <w:r/>
+            <w:r>
+              <w:rPr>
+                <w:b w:val="0"/>
+                <w:sz w:val="18"/>
+              </w:rPr>
+              <w:t>Δ=86 Hz</w:t>
+            </w:r>
+          </w:p>
+        </w:tc>
+        <w:tc>
+          <w:tcPr>
+            <w:tcW w:type="dxa" w:w="1417"/>
+          </w:tcPr>
+          <w:p>
+            <w:pPr>
+              <w:jc w:val="center"/>
+            </w:pPr>
+            <w:r/>
+            <w:r>
+              <w:rPr>
+                <w:b w:val="0"/>
+                <w:sz w:val="18"/>
+              </w:rPr>
+              <w:t>Bonne</w:t>
+            </w:r>
+          </w:p>
+        </w:tc>
+        <w:tc>
+          <w:tcPr>
+            <w:tcW w:type="dxa" w:w="1417"/>
+          </w:tcPr>
+          <w:p>
+            <w:pPr>
+              <w:jc w:val="center"/>
+            </w:pPr>
+            <w:r/>
+            <w:r>
+              <w:rPr>
+                <w:b w:val="0"/>
+                <w:sz w:val="18"/>
+              </w:rPr>
+              <w:t>Octave</w:t>
             </w:r>
           </w:p>
         </w:tc>
@@ -15779,7 +16327,7 @@
           <w:i/>
           <w:sz w:val="20"/>
         </w:rPr>
-        <w:t>Son profond et rond, fondation harmonique de l'orchestre. F1=249 Hz (zone /u/) — profondeur extrême. Accord entre sources approximatif car chaque source mesure un registre différent (Backus 200–400, Meyer 210–250). Fp=1 239 Hz capture la zone d'énergie principale du pavillon. Le tuba est le seul cuivre dont F1 ne rejoint jamais le cluster /o/.</w:t>
+        <w:t>Son profond et rond, fondation harmonique de l'orchestre. F1=226 Hz (zone /u/) — unisson formantique parfait avec le tuba contrebasse et le contrebasson (tous à 226 Hz). Accord entre sources approximatif car chaque source mesure un registre différent (Backus 200–400, Meyer 210–250). Fp=1 239 Hz capture la zone d'énergie principale du pavillon.</w:t>
       </w:r>
     </w:p>
     <w:p>
@@ -16434,7 +16982,7 @@
                 <w:b/>
                 <w:sz w:val="18"/>
               </w:rPr>
-              <w:t>SOL2020</w:t>
+              <w:t>SOL2020 (Fp)</w:t>
             </w:r>
           </w:p>
         </w:tc>
@@ -16567,7 +17115,153 @@
                 <w:b w:val="0"/>
                 <w:sz w:val="18"/>
               </w:rPr>
-              <w:t>approx</w:t>
+              <w:t>réf.</w:t>
+            </w:r>
+          </w:p>
+        </w:tc>
+      </w:tr>
+      <w:tr>
+        <w:tc>
+          <w:tcPr>
+            <w:tcW w:type="dxa" w:w="1701"/>
+          </w:tcPr>
+          <w:p>
+            <w:pPr>
+              <w:jc w:val="center"/>
+            </w:pPr>
+            <w:r/>
+            <w:r>
+              <w:rPr>
+                <w:b/>
+                <w:sz w:val="18"/>
+              </w:rPr>
+              <w:t>Pipeline v22</w:t>
+            </w:r>
+          </w:p>
+        </w:tc>
+        <w:tc>
+          <w:tcPr>
+            <w:tcW w:type="dxa" w:w="1020"/>
+          </w:tcPr>
+          <w:p>
+            <w:pPr>
+              <w:jc w:val="center"/>
+            </w:pPr>
+            <w:r/>
+            <w:r>
+              <w:rPr>
+                <w:b w:val="0"/>
+                <w:sz w:val="18"/>
+              </w:rPr>
+              <w:t>226</w:t>
+            </w:r>
+          </w:p>
+        </w:tc>
+        <w:tc>
+          <w:tcPr>
+            <w:tcW w:type="dxa" w:w="1020"/>
+          </w:tcPr>
+          <w:p>
+            <w:pPr>
+              <w:jc w:val="center"/>
+            </w:pPr>
+            <w:r/>
+            <w:r>
+              <w:rPr>
+                <w:b w:val="0"/>
+                <w:sz w:val="18"/>
+              </w:rPr>
+              <w:t>452</w:t>
+            </w:r>
+          </w:p>
+        </w:tc>
+        <w:tc>
+          <w:tcPr>
+            <w:tcW w:type="dxa" w:w="1020"/>
+          </w:tcPr>
+          <w:p>
+            <w:pPr>
+              <w:jc w:val="center"/>
+            </w:pPr>
+            <w:r/>
+            <w:r>
+              <w:rPr>
+                <w:b w:val="0"/>
+                <w:sz w:val="18"/>
+              </w:rPr>
+              <w:t>—</w:t>
+            </w:r>
+          </w:p>
+        </w:tc>
+        <w:tc>
+          <w:tcPr>
+            <w:tcW w:type="dxa" w:w="1020"/>
+          </w:tcPr>
+          <w:p>
+            <w:pPr>
+              <w:jc w:val="center"/>
+            </w:pPr>
+            <w:r/>
+            <w:r>
+              <w:rPr>
+                <w:b w:val="0"/>
+                <w:sz w:val="18"/>
+              </w:rPr>
+              <w:t>—</w:t>
+            </w:r>
+          </w:p>
+        </w:tc>
+        <w:tc>
+          <w:tcPr>
+            <w:tcW w:type="dxa" w:w="1020"/>
+          </w:tcPr>
+          <w:p>
+            <w:pPr>
+              <w:jc w:val="center"/>
+            </w:pPr>
+            <w:r/>
+            <w:r>
+              <w:rPr>
+                <w:b w:val="0"/>
+                <w:sz w:val="18"/>
+              </w:rPr>
+              <w:t>u</w:t>
+            </w:r>
+          </w:p>
+        </w:tc>
+        <w:tc>
+          <w:tcPr>
+            <w:tcW w:type="dxa" w:w="567"/>
+          </w:tcPr>
+          <w:p>
+            <w:pPr>
+              <w:jc w:val="center"/>
+            </w:pPr>
+            <w:r/>
+            <w:r>
+              <w:rPr>
+                <w:b w:val="0"/>
+                <w:sz w:val="18"/>
+              </w:rPr>
+              <w:t>108</w:t>
+            </w:r>
+          </w:p>
+        </w:tc>
+        <w:tc>
+          <w:tcPr>
+            <w:tcW w:type="dxa" w:w="680"/>
+          </w:tcPr>
+          <w:p>
+            <w:pPr>
+              <w:jc w:val="center"/>
+            </w:pPr>
+            <w:r/>
+            <w:r>
+              <w:rPr>
+                <w:b w:val="0"/>
+                <w:sz w:val="18"/>
+              </w:rPr>
+              <w:t>réf.</w:t>
             </w:r>
           </w:p>
         </w:tc>
@@ -23095,7 +23789,7 @@
                 <w:b/>
                 <w:sz w:val="18"/>
               </w:rPr>
-              <w:t>Contrebasse</w:t>
+              <w:t>Contrebasson</w:t>
             </w:r>
           </w:p>
         </w:tc>
@@ -23113,7 +23807,7 @@
                 <w:b w:val="0"/>
                 <w:sz w:val="18"/>
               </w:rPr>
-              <w:t>249</w:t>
+              <w:t>226</w:t>
             </w:r>
           </w:p>
         </w:tc>
@@ -23131,7 +23825,7 @@
                 <w:b w:val="0"/>
                 <w:sz w:val="18"/>
               </w:rPr>
-              <w:t>200</w:t>
+              <w:t>226</w:t>
             </w:r>
           </w:p>
         </w:tc>
@@ -23149,7 +23843,7 @@
                 <w:b w:val="0"/>
                 <w:sz w:val="18"/>
               </w:rPr>
-              <w:t>Δ=49 Hz</w:t>
+              <w:t>Δ=0 Hz</w:t>
             </w:r>
           </w:p>
         </w:tc>
@@ -23167,7 +23861,7 @@
                 <w:b w:val="0"/>
                 <w:sz w:val="18"/>
               </w:rPr>
-              <w:t>Bonne</w:t>
+              <w:t>Quasi-parfaite ★</w:t>
             </w:r>
           </w:p>
         </w:tc>
@@ -23205,7 +23899,7 @@
                 <w:b/>
                 <w:sz w:val="18"/>
               </w:rPr>
-              <w:t>Contrebasson</w:t>
+              <w:t>Tuba contrebasse</w:t>
             </w:r>
           </w:p>
         </w:tc>
@@ -23223,7 +23917,7 @@
                 <w:b w:val="0"/>
                 <w:sz w:val="18"/>
               </w:rPr>
-              <w:t>249</w:t>
+              <w:t>226</w:t>
             </w:r>
           </w:p>
         </w:tc>
@@ -23259,7 +23953,7 @@
                 <w:b w:val="0"/>
                 <w:sz w:val="18"/>
               </w:rPr>
-              <w:t>Δ=23 Hz</w:t>
+              <w:t>Δ=0 Hz</w:t>
             </w:r>
           </w:p>
         </w:tc>
@@ -23277,7 +23971,7 @@
                 <w:b w:val="0"/>
                 <w:sz w:val="18"/>
               </w:rPr>
-              <w:t>Excellente</w:t>
+              <w:t>Quasi-parfaite ★</w:t>
             </w:r>
           </w:p>
         </w:tc>
@@ -23295,7 +23989,7 @@
                 <w:b w:val="0"/>
                 <w:sz w:val="18"/>
               </w:rPr>
-              <w:t>Unisson</w:t>
+              <w:t>Octave</w:t>
             </w:r>
           </w:p>
         </w:tc>
@@ -23315,7 +24009,7 @@
                 <w:b/>
                 <w:sz w:val="18"/>
               </w:rPr>
-              <w:t>Cor anglais</w:t>
+              <w:t>Trombone</w:t>
             </w:r>
           </w:p>
         </w:tc>
@@ -23333,7 +24027,7 @@
                 <w:b w:val="0"/>
                 <w:sz w:val="18"/>
               </w:rPr>
-              <w:t>249</w:t>
+              <w:t>226</w:t>
             </w:r>
           </w:p>
         </w:tc>
@@ -23351,7 +24045,7 @@
                 <w:b w:val="0"/>
                 <w:sz w:val="18"/>
               </w:rPr>
-              <w:t>452</w:t>
+              <w:t>237</w:t>
             </w:r>
           </w:p>
         </w:tc>
@@ -23369,7 +24063,7 @@
                 <w:b w:val="0"/>
                 <w:sz w:val="18"/>
               </w:rPr>
-              <w:t>Δ=203 Hz</w:t>
+              <w:t>Δ=11 Hz</w:t>
             </w:r>
           </w:p>
         </w:tc>
@@ -23387,7 +24081,7 @@
                 <w:b w:val="0"/>
                 <w:sz w:val="18"/>
               </w:rPr>
-              <w:t>Complémentaire</w:t>
+              <w:t>Quasi-parfaite</w:t>
             </w:r>
           </w:p>
         </w:tc>
@@ -23405,7 +24099,117 @@
                 <w:b w:val="0"/>
                 <w:sz w:val="18"/>
               </w:rPr>
-              <w:t>2 octaves</w:t>
+              <w:t>Octave</w:t>
+            </w:r>
+          </w:p>
+        </w:tc>
+      </w:tr>
+      <w:tr>
+        <w:tc>
+          <w:tcPr>
+            <w:tcW w:type="dxa" w:w="1814"/>
+          </w:tcPr>
+          <w:p>
+            <w:pPr>
+              <w:jc w:val="center"/>
+            </w:pPr>
+            <w:r/>
+            <w:r>
+              <w:rPr>
+                <w:b/>
+                <w:sz w:val="18"/>
+              </w:rPr>
+              <w:t>Contrebasse</w:t>
+            </w:r>
+          </w:p>
+        </w:tc>
+        <w:tc>
+          <w:tcPr>
+            <w:tcW w:type="dxa" w:w="907"/>
+          </w:tcPr>
+          <w:p>
+            <w:pPr>
+              <w:jc w:val="center"/>
+            </w:pPr>
+            <w:r/>
+            <w:r>
+              <w:rPr>
+                <w:b w:val="0"/>
+                <w:sz w:val="18"/>
+              </w:rPr>
+              <w:t>226</w:t>
+            </w:r>
+          </w:p>
+        </w:tc>
+        <w:tc>
+          <w:tcPr>
+            <w:tcW w:type="dxa" w:w="907"/>
+          </w:tcPr>
+          <w:p>
+            <w:pPr>
+              <w:jc w:val="center"/>
+            </w:pPr>
+            <w:r/>
+            <w:r>
+              <w:rPr>
+                <w:b w:val="0"/>
+                <w:sz w:val="18"/>
+              </w:rPr>
+              <w:t>172</w:t>
+            </w:r>
+          </w:p>
+        </w:tc>
+        <w:tc>
+          <w:tcPr>
+            <w:tcW w:type="dxa" w:w="1020"/>
+          </w:tcPr>
+          <w:p>
+            <w:pPr>
+              <w:jc w:val="center"/>
+            </w:pPr>
+            <w:r/>
+            <w:r>
+              <w:rPr>
+                <w:b w:val="0"/>
+                <w:sz w:val="18"/>
+              </w:rPr>
+              <w:t>Δ=54 Hz</w:t>
+            </w:r>
+          </w:p>
+        </w:tc>
+        <w:tc>
+          <w:tcPr>
+            <w:tcW w:type="dxa" w:w="1417"/>
+          </w:tcPr>
+          <w:p>
+            <w:pPr>
+              <w:jc w:val="center"/>
+            </w:pPr>
+            <w:r/>
+            <w:r>
+              <w:rPr>
+                <w:b w:val="0"/>
+                <w:sz w:val="18"/>
+              </w:rPr>
+              <w:t>Excellente</w:t>
+            </w:r>
+          </w:p>
+        </w:tc>
+        <w:tc>
+          <w:tcPr>
+            <w:tcW w:type="dxa" w:w="1417"/>
+          </w:tcPr>
+          <w:p>
+            <w:pPr>
+              <w:jc w:val="center"/>
+            </w:pPr>
+            <w:r/>
+            <w:r>
+              <w:rPr>
+                <w:b w:val="0"/>
+                <w:sz w:val="18"/>
+              </w:rPr>
+              <w:t>Unisson</w:t>
             </w:r>
           </w:p>
         </w:tc>
@@ -23469,7 +24273,7 @@
           <w:i/>
           <w:sz w:val="20"/>
         </w:rPr>
-        <w:t>Son extrêmement grave et massif. F1=471 Hz dans le cluster de convergence — contrairement au tuba basse (249 Hz), le tuba contrebasse rejoint le cluster /o/ aux côtés du cor et du trombone. Cette découverte explique son rôle de fondation harmonique des cuivres graves dans un registre différent du tuba standard. Fp=1 182 Hz.</w:t>
+        <w:t>Son extrêmement grave et massif. F1=226 Hz (zone /u/) — identique au tuba basse et au contrebasson. Cet unisson formantique parfait entre trois familles différentes (cuivres × 2 + bois) constitue la fondation /u/ de l'orchestre. Fp=1 182 Hz.</w:t>
       </w:r>
     </w:p>
     <w:p>
@@ -23686,7 +24490,7 @@
                 <w:b/>
                 <w:sz w:val="18"/>
               </w:rPr>
-              <w:t>Yan_Adds</w:t>
+              <w:t>Yan_Adds (Fp)</w:t>
             </w:r>
           </w:p>
         </w:tc>
@@ -23819,7 +24623,153 @@
                 <w:b w:val="0"/>
                 <w:sz w:val="18"/>
               </w:rPr>
+              <w:t>note</w:t>
+            </w:r>
+          </w:p>
+        </w:tc>
+      </w:tr>
+      <w:tr>
+        <w:tc>
+          <w:tcPr>
+            <w:tcW w:type="dxa" w:w="1701"/>
+          </w:tcPr>
+          <w:p>
+            <w:pPr>
+              <w:jc w:val="center"/>
+            </w:pPr>
+            <w:r/>
+            <w:r>
+              <w:rPr>
+                <w:b/>
+                <w:sz w:val="18"/>
+              </w:rPr>
+              <w:t>Pipeline v22</w:t>
+            </w:r>
+          </w:p>
+        </w:tc>
+        <w:tc>
+          <w:tcPr>
+            <w:tcW w:type="dxa" w:w="1020"/>
+          </w:tcPr>
+          <w:p>
+            <w:pPr>
+              <w:jc w:val="center"/>
+            </w:pPr>
+            <w:r/>
+            <w:r>
+              <w:rPr>
+                <w:b w:val="0"/>
+                <w:sz w:val="18"/>
+              </w:rPr>
+              <w:t>226</w:t>
+            </w:r>
+          </w:p>
+        </w:tc>
+        <w:tc>
+          <w:tcPr>
+            <w:tcW w:type="dxa" w:w="1020"/>
+          </w:tcPr>
+          <w:p>
+            <w:pPr>
+              <w:jc w:val="center"/>
+            </w:pPr>
+            <w:r/>
+            <w:r>
+              <w:rPr>
+                <w:b w:val="0"/>
+                <w:sz w:val="18"/>
+              </w:rPr>
               <w:t>—</w:t>
+            </w:r>
+          </w:p>
+        </w:tc>
+        <w:tc>
+          <w:tcPr>
+            <w:tcW w:type="dxa" w:w="1020"/>
+          </w:tcPr>
+          <w:p>
+            <w:pPr>
+              <w:jc w:val="center"/>
+            </w:pPr>
+            <w:r/>
+            <w:r>
+              <w:rPr>
+                <w:b w:val="0"/>
+                <w:sz w:val="18"/>
+              </w:rPr>
+              <w:t>—</w:t>
+            </w:r>
+          </w:p>
+        </w:tc>
+        <w:tc>
+          <w:tcPr>
+            <w:tcW w:type="dxa" w:w="1020"/>
+          </w:tcPr>
+          <w:p>
+            <w:pPr>
+              <w:jc w:val="center"/>
+            </w:pPr>
+            <w:r/>
+            <w:r>
+              <w:rPr>
+                <w:b w:val="0"/>
+                <w:sz w:val="18"/>
+              </w:rPr>
+              <w:t>—</w:t>
+            </w:r>
+          </w:p>
+        </w:tc>
+        <w:tc>
+          <w:tcPr>
+            <w:tcW w:type="dxa" w:w="1020"/>
+          </w:tcPr>
+          <w:p>
+            <w:pPr>
+              <w:jc w:val="center"/>
+            </w:pPr>
+            <w:r/>
+            <w:r>
+              <w:rPr>
+                <w:b w:val="0"/>
+                <w:sz w:val="18"/>
+              </w:rPr>
+              <w:t>u</w:t>
+            </w:r>
+          </w:p>
+        </w:tc>
+        <w:tc>
+          <w:tcPr>
+            <w:tcW w:type="dxa" w:w="567"/>
+          </w:tcPr>
+          <w:p>
+            <w:pPr>
+              <w:jc w:val="center"/>
+            </w:pPr>
+            <w:r/>
+            <w:r>
+              <w:rPr>
+                <w:b w:val="0"/>
+                <w:sz w:val="18"/>
+              </w:rPr>
+              <w:t>135</w:t>
+            </w:r>
+          </w:p>
+        </w:tc>
+        <w:tc>
+          <w:tcPr>
+            <w:tcW w:type="dxa" w:w="680"/>
+          </w:tcPr>
+          <w:p>
+            <w:pPr>
+              <w:jc w:val="center"/>
+            </w:pPr>
+            <w:r/>
+            <w:r>
+              <w:rPr>
+                <w:b w:val="0"/>
+                <w:sz w:val="18"/>
+              </w:rPr>
+              <w:t>réf.</w:t>
             </w:r>
           </w:p>
         </w:tc>
@@ -24475,7 +25425,7 @@
                 <w:b/>
                 <w:sz w:val="18"/>
               </w:rPr>
-              <w:t>Cor</w:t>
+              <w:t>Contrebasson</w:t>
             </w:r>
           </w:p>
         </w:tc>
@@ -24493,7 +25443,7 @@
                 <w:b w:val="0"/>
                 <w:sz w:val="18"/>
               </w:rPr>
-              <w:t>471</w:t>
+              <w:t>226</w:t>
             </w:r>
           </w:p>
         </w:tc>
@@ -24511,7 +25461,7 @@
                 <w:b w:val="0"/>
                 <w:sz w:val="18"/>
               </w:rPr>
-              <w:t>457</w:t>
+              <w:t>226</w:t>
             </w:r>
           </w:p>
         </w:tc>
@@ -24529,7 +25479,7 @@
                 <w:b w:val="0"/>
                 <w:sz w:val="18"/>
               </w:rPr>
-              <w:t>Δ=14 Hz</w:t>
+              <w:t>Δ=0 Hz</w:t>
             </w:r>
           </w:p>
         </w:tc>
@@ -24547,7 +25497,7 @@
                 <w:b w:val="0"/>
                 <w:sz w:val="18"/>
               </w:rPr>
-              <w:t>Quasi-parfaite</w:t>
+              <w:t>Quasi-parfaite ★</w:t>
             </w:r>
           </w:p>
         </w:tc>
@@ -24565,7 +25515,7 @@
                 <w:b w:val="0"/>
                 <w:sz w:val="18"/>
               </w:rPr>
-              <w:t>Octave</w:t>
+              <w:t>Unisson</w:t>
             </w:r>
           </w:p>
         </w:tc>
@@ -24585,7 +25535,7 @@
                 <w:b/>
                 <w:sz w:val="18"/>
               </w:rPr>
-              <w:t>Trombone</w:t>
+              <w:t>Tuba basse</w:t>
             </w:r>
           </w:p>
         </w:tc>
@@ -24603,7 +25553,7 @@
                 <w:b w:val="0"/>
                 <w:sz w:val="18"/>
               </w:rPr>
-              <w:t>471</w:t>
+              <w:t>226</w:t>
             </w:r>
           </w:p>
         </w:tc>
@@ -24621,7 +25571,7 @@
                 <w:b w:val="0"/>
                 <w:sz w:val="18"/>
               </w:rPr>
-              <w:t>491</w:t>
+              <w:t>226</w:t>
             </w:r>
           </w:p>
         </w:tc>
@@ -24639,7 +25589,7 @@
                 <w:b w:val="0"/>
                 <w:sz w:val="18"/>
               </w:rPr>
-              <w:t>Δ=20 Hz</w:t>
+              <w:t>Δ=0 Hz</w:t>
             </w:r>
           </w:p>
         </w:tc>
@@ -24657,7 +25607,7 @@
                 <w:b w:val="0"/>
                 <w:sz w:val="18"/>
               </w:rPr>
-              <w:t>Quasi-parfaite</w:t>
+              <w:t>Quasi-parfaite ★</w:t>
             </w:r>
           </w:p>
         </w:tc>
@@ -24695,7 +25645,7 @@
                 <w:b/>
                 <w:sz w:val="18"/>
               </w:rPr>
-              <w:t>Basson</w:t>
+              <w:t>Trombone</w:t>
             </w:r>
           </w:p>
         </w:tc>
@@ -24713,7 +25663,7 @@
                 <w:b w:val="0"/>
                 <w:sz w:val="18"/>
               </w:rPr>
-              <w:t>471</w:t>
+              <w:t>226</w:t>
             </w:r>
           </w:p>
         </w:tc>
@@ -24731,7 +25681,7 @@
                 <w:b w:val="0"/>
                 <w:sz w:val="18"/>
               </w:rPr>
-              <w:t>502</w:t>
+              <w:t>237</w:t>
             </w:r>
           </w:p>
         </w:tc>
@@ -24749,7 +25699,7 @@
                 <w:b w:val="0"/>
                 <w:sz w:val="18"/>
               </w:rPr>
-              <w:t>Δ=31 Hz</w:t>
+              <w:t>Δ=11 Hz</w:t>
             </w:r>
           </w:p>
         </w:tc>
@@ -24767,7 +25717,7 @@
                 <w:b w:val="0"/>
                 <w:sz w:val="18"/>
               </w:rPr>
-              <w:t>Excellente</w:t>
+              <w:t>Quasi-parfaite</w:t>
             </w:r>
           </w:p>
         </w:tc>
@@ -24805,7 +25755,7 @@
                 <w:b/>
                 <w:sz w:val="18"/>
               </w:rPr>
-              <w:t>Violoncelle</w:t>
+              <w:t>Contrebasse</w:t>
             </w:r>
           </w:p>
         </w:tc>
@@ -24823,7 +25773,7 @@
                 <w:b w:val="0"/>
                 <w:sz w:val="18"/>
               </w:rPr>
-              <w:t>471</w:t>
+              <w:t>226</w:t>
             </w:r>
           </w:p>
         </w:tc>
@@ -24841,7 +25791,7 @@
                 <w:b w:val="0"/>
                 <w:sz w:val="18"/>
               </w:rPr>
-              <w:t>499</w:t>
+              <w:t>172</w:t>
             </w:r>
           </w:p>
         </w:tc>
@@ -24859,7 +25809,7 @@
                 <w:b w:val="0"/>
                 <w:sz w:val="18"/>
               </w:rPr>
-              <w:t>Δ=28 Hz</w:t>
+              <w:t>Δ=54 Hz</w:t>
             </w:r>
           </w:p>
         </w:tc>
@@ -24988,7 +25938,7 @@
           <w:i/>
           <w:sz w:val="20"/>
         </w:rPr>
-        <w:t>F1 descend de 457 à 344 Hz, la sourdine déplace les formants vers le grave avec une légère nasalité. Son voilé et lointain.</w:t>
+        <w:t>F1 descend de 388 à 344 Hz (−11 %), la sourdine déplace légèrement le spectre vers le grave. Son voilé et lointain.</w:t>
       </w:r>
     </w:p>
     <w:p>
@@ -25000,6 +25950,374 @@
           <w:sz w:val="20"/>
         </w:rPr>
         <w:t>Fp (centroïde) = 804 Hz</w:t>
+      </w:r>
+    </w:p>
+    <w:p/>
+    <w:p>
+      <w:pPr>
+        <w:pStyle w:val="Heading3"/>
+      </w:pPr>
+      <w:r>
+        <w:t>Trompette avec sourdines</w:t>
+      </w:r>
+    </w:p>
+    <w:p>
+      <w:pPr>
+        <w:pStyle w:val="Heading2"/>
+      </w:pPr>
+      <w:r>
+        <w:rPr>
+          <w:color w:val="B71C1C"/>
+        </w:rPr>
+        <w:t>Trompette + sourd. cup</w:t>
+      </w:r>
+    </w:p>
+    <w:p>
+      <w:pPr>
+        <w:jc w:val="center"/>
+      </w:pPr>
+      <w:r>
+        <w:drawing>
+          <wp:inline xmlns:a="http://schemas.openxmlformats.org/drawingml/2006/main" xmlns:pic="http://schemas.openxmlformats.org/drawingml/2006/picture">
+            <wp:extent cx="5943600" cy="2948763"/>
+            <wp:docPr id="8" name="Picture 8"/>
+            <wp:cNvGraphicFramePr>
+              <a:graphicFrameLocks noChangeAspect="1"/>
+            </wp:cNvGraphicFramePr>
+            <a:graphic>
+              <a:graphicData uri="http://schemas.openxmlformats.org/drawingml/2006/picture">
+                <pic:pic>
+                  <pic:nvPicPr>
+                    <pic:cNvPr id="0" name="cuivres_tpt_cup.png"/>
+                    <pic:cNvPicPr/>
+                  </pic:nvPicPr>
+                  <pic:blipFill>
+                    <a:blip r:embed="rId16"/>
+                    <a:stretch>
+                      <a:fillRect/>
+                    </a:stretch>
+                  </pic:blipFill>
+                  <pic:spPr>
+                    <a:xfrm>
+                      <a:off x="0" y="0"/>
+                      <a:ext cx="5943600" cy="2948763"/>
+                    </a:xfrm>
+                    <a:prstGeom prst="rect"/>
+                  </pic:spPr>
+                </pic:pic>
+              </a:graphicData>
+            </a:graphic>
+          </wp:inline>
+        </w:drawing>
+      </w:r>
+    </w:p>
+    <w:p>
+      <w:r>
+        <w:rPr>
+          <w:b w:val="0"/>
+          <w:i/>
+          <w:sz w:val="20"/>
+        </w:rPr>
+        <w:t>F1 monte à 1 443 Hz (+84 %). Son doux et arrondi, perd la brillance caractéristique.</w:t>
+      </w:r>
+    </w:p>
+    <w:p>
+      <w:r>
+        <w:rPr>
+          <w:b/>
+          <w:i w:val="0"/>
+          <w:color w:val="1B5E20"/>
+          <w:sz w:val="20"/>
+        </w:rPr>
+        <w:t>Fp (centroïde) = 1260 Hz</w:t>
+      </w:r>
+    </w:p>
+    <w:p/>
+    <w:p>
+      <w:pPr>
+        <w:pStyle w:val="Heading2"/>
+      </w:pPr>
+      <w:r>
+        <w:rPr>
+          <w:color w:val="B71C1C"/>
+        </w:rPr>
+        <w:t>Trompette + sourd. sèche</w:t>
+      </w:r>
+    </w:p>
+    <w:p>
+      <w:pPr>
+        <w:jc w:val="center"/>
+      </w:pPr>
+      <w:r>
+        <w:drawing>
+          <wp:inline xmlns:a="http://schemas.openxmlformats.org/drawingml/2006/main" xmlns:pic="http://schemas.openxmlformats.org/drawingml/2006/picture">
+            <wp:extent cx="5943600" cy="2944613"/>
+            <wp:docPr id="9" name="Picture 9"/>
+            <wp:cNvGraphicFramePr>
+              <a:graphicFrameLocks noChangeAspect="1"/>
+            </wp:cNvGraphicFramePr>
+            <a:graphic>
+              <a:graphicData uri="http://schemas.openxmlformats.org/drawingml/2006/picture">
+                <pic:pic>
+                  <pic:nvPicPr>
+                    <pic:cNvPr id="0" name="cuivres_tpt_straight.png"/>
+                    <pic:cNvPicPr/>
+                  </pic:nvPicPr>
+                  <pic:blipFill>
+                    <a:blip r:embed="rId17"/>
+                    <a:stretch>
+                      <a:fillRect/>
+                    </a:stretch>
+                  </pic:blipFill>
+                  <pic:spPr>
+                    <a:xfrm>
+                      <a:off x="0" y="0"/>
+                      <a:ext cx="5943600" cy="2944613"/>
+                    </a:xfrm>
+                    <a:prstGeom prst="rect"/>
+                  </pic:spPr>
+                </pic:pic>
+              </a:graphicData>
+            </a:graphic>
+          </wp:inline>
+        </w:drawing>
+      </w:r>
+    </w:p>
+    <w:p>
+      <w:r>
+        <w:rPr>
+          <w:b w:val="0"/>
+          <w:i/>
+          <w:sz w:val="20"/>
+        </w:rPr>
+        <w:t>F1=1 098 Hz (+40 %). Son piquant et nasal, le plus utilisé en orchestre.</w:t>
+      </w:r>
+    </w:p>
+    <w:p>
+      <w:r>
+        <w:rPr>
+          <w:b/>
+          <w:i w:val="0"/>
+          <w:color w:val="1B5E20"/>
+          <w:sz w:val="20"/>
+        </w:rPr>
+        <w:t>Fp (centroïde) = 1084 Hz</w:t>
+      </w:r>
+    </w:p>
+    <w:p/>
+    <w:p>
+      <w:pPr>
+        <w:pStyle w:val="Heading2"/>
+      </w:pPr>
+      <w:r>
+        <w:rPr>
+          <w:color w:val="B71C1C"/>
+        </w:rPr>
+        <w:t>Trompette + sourd. harmon</w:t>
+      </w:r>
+    </w:p>
+    <w:p>
+      <w:pPr>
+        <w:jc w:val="center"/>
+      </w:pPr>
+      <w:r>
+        <w:drawing>
+          <wp:inline xmlns:a="http://schemas.openxmlformats.org/drawingml/2006/main" xmlns:pic="http://schemas.openxmlformats.org/drawingml/2006/picture">
+            <wp:extent cx="5943600" cy="2938409"/>
+            <wp:docPr id="10" name="Picture 10"/>
+            <wp:cNvGraphicFramePr>
+              <a:graphicFrameLocks noChangeAspect="1"/>
+            </wp:cNvGraphicFramePr>
+            <a:graphic>
+              <a:graphicData uri="http://schemas.openxmlformats.org/drawingml/2006/picture">
+                <pic:pic>
+                  <pic:nvPicPr>
+                    <pic:cNvPr id="0" name="cuivres_tpt_harmon.png"/>
+                    <pic:cNvPicPr/>
+                  </pic:nvPicPr>
+                  <pic:blipFill>
+                    <a:blip r:embed="rId18"/>
+                    <a:stretch>
+                      <a:fillRect/>
+                    </a:stretch>
+                  </pic:blipFill>
+                  <pic:spPr>
+                    <a:xfrm>
+                      <a:off x="0" y="0"/>
+                      <a:ext cx="5943600" cy="2938409"/>
+                    </a:xfrm>
+                    <a:prstGeom prst="rect"/>
+                  </pic:spPr>
+                </pic:pic>
+              </a:graphicData>
+            </a:graphic>
+          </wp:inline>
+        </w:drawing>
+      </w:r>
+    </w:p>
+    <w:p>
+      <w:r>
+        <w:rPr>
+          <w:b w:val="0"/>
+          <w:i/>
+          <w:sz w:val="20"/>
+        </w:rPr>
+        <w:t>F1=2 358 Hz (+200 %) — tout le spectre propulsé dans la zone /i/. Son miles-davisien.</w:t>
+      </w:r>
+    </w:p>
+    <w:p>
+      <w:r>
+        <w:rPr>
+          <w:b/>
+          <w:i w:val="0"/>
+          <w:color w:val="1B5E20"/>
+          <w:sz w:val="20"/>
+        </w:rPr>
+        <w:t>Fp (centroïde) = 1443 Hz</w:t>
+      </w:r>
+    </w:p>
+    <w:p/>
+    <w:p>
+      <w:pPr>
+        <w:pStyle w:val="Heading2"/>
+      </w:pPr>
+      <w:r>
+        <w:rPr>
+          <w:color w:val="B71C1C"/>
+        </w:rPr>
+        <w:t>Trompette + sourd. wah (ouvert)</w:t>
+      </w:r>
+    </w:p>
+    <w:p>
+      <w:pPr>
+        <w:jc w:val="center"/>
+      </w:pPr>
+      <w:r>
+        <w:drawing>
+          <wp:inline xmlns:a="http://schemas.openxmlformats.org/drawingml/2006/main" xmlns:pic="http://schemas.openxmlformats.org/drawingml/2006/picture">
+            <wp:extent cx="5943600" cy="2936347"/>
+            <wp:docPr id="11" name="Picture 11"/>
+            <wp:cNvGraphicFramePr>
+              <a:graphicFrameLocks noChangeAspect="1"/>
+            </wp:cNvGraphicFramePr>
+            <a:graphic>
+              <a:graphicData uri="http://schemas.openxmlformats.org/drawingml/2006/picture">
+                <pic:pic>
+                  <pic:nvPicPr>
+                    <pic:cNvPr id="0" name="cuivres_tpt_wah_open.png"/>
+                    <pic:cNvPicPr/>
+                  </pic:nvPicPr>
+                  <pic:blipFill>
+                    <a:blip r:embed="rId19"/>
+                    <a:stretch>
+                      <a:fillRect/>
+                    </a:stretch>
+                  </pic:blipFill>
+                  <pic:spPr>
+                    <a:xfrm>
+                      <a:off x="0" y="0"/>
+                      <a:ext cx="5943600" cy="2936347"/>
+                    </a:xfrm>
+                    <a:prstGeom prst="rect"/>
+                  </pic:spPr>
+                </pic:pic>
+              </a:graphicData>
+            </a:graphic>
+          </wp:inline>
+        </w:drawing>
+      </w:r>
+    </w:p>
+    <w:p>
+      <w:r>
+        <w:rPr>
+          <w:b w:val="0"/>
+          <w:i/>
+          <w:sz w:val="20"/>
+        </w:rPr>
+        <w:t>F1 descend à 560 Hz (−29 %). Son nasal et brillant.</w:t>
+      </w:r>
+    </w:p>
+    <w:p>
+      <w:r>
+        <w:rPr>
+          <w:b/>
+          <w:i w:val="0"/>
+          <w:color w:val="1B5E20"/>
+          <w:sz w:val="20"/>
+        </w:rPr>
+        <w:t>Fp (centroïde) = 916 Hz</w:t>
+      </w:r>
+    </w:p>
+    <w:p/>
+    <w:p>
+      <w:pPr>
+        <w:pStyle w:val="Heading2"/>
+      </w:pPr>
+      <w:r>
+        <w:rPr>
+          <w:color w:val="B71C1C"/>
+        </w:rPr>
+        <w:t>Trompette + sourd. wah (fermé)</w:t>
+      </w:r>
+    </w:p>
+    <w:p>
+      <w:pPr>
+        <w:jc w:val="center"/>
+      </w:pPr>
+      <w:r>
+        <w:drawing>
+          <wp:inline xmlns:a="http://schemas.openxmlformats.org/drawingml/2006/main" xmlns:pic="http://schemas.openxmlformats.org/drawingml/2006/picture">
+            <wp:extent cx="5943600" cy="2948763"/>
+            <wp:docPr id="12" name="Picture 12"/>
+            <wp:cNvGraphicFramePr>
+              <a:graphicFrameLocks noChangeAspect="1"/>
+            </wp:cNvGraphicFramePr>
+            <a:graphic>
+              <a:graphicData uri="http://schemas.openxmlformats.org/drawingml/2006/picture">
+                <pic:pic>
+                  <pic:nvPicPr>
+                    <pic:cNvPr id="0" name="cuivres_tpt_wah_closed.png"/>
+                    <pic:cNvPicPr/>
+                  </pic:nvPicPr>
+                  <pic:blipFill>
+                    <a:blip r:embed="rId20"/>
+                    <a:stretch>
+                      <a:fillRect/>
+                    </a:stretch>
+                  </pic:blipFill>
+                  <pic:spPr>
+                    <a:xfrm>
+                      <a:off x="0" y="0"/>
+                      <a:ext cx="5943600" cy="2948763"/>
+                    </a:xfrm>
+                    <a:prstGeom prst="rect"/>
+                  </pic:spPr>
+                </pic:pic>
+              </a:graphicData>
+            </a:graphic>
+          </wp:inline>
+        </w:drawing>
+      </w:r>
+    </w:p>
+    <w:p>
+      <w:r>
+        <w:rPr>
+          <w:b w:val="0"/>
+          <w:i/>
+          <w:sz w:val="20"/>
+        </w:rPr>
+        <w:t>F1=581 Hz (−26 %). Son étouffé, spectre fortement filtré.</w:t>
+      </w:r>
+    </w:p>
+    <w:p>
+      <w:r>
+        <w:rPr>
+          <w:b/>
+          <w:i w:val="0"/>
+          <w:color w:val="1B5E20"/>
+          <w:sz w:val="20"/>
+        </w:rPr>
+        <w:t>Fp (centroïde) = 935 Hz</w:t>
       </w:r>
     </w:p>
     <w:p/>
@@ -25030,7 +26348,7 @@
         <w:drawing>
           <wp:inline xmlns:a="http://schemas.openxmlformats.org/drawingml/2006/main" xmlns:pic="http://schemas.openxmlformats.org/drawingml/2006/picture">
             <wp:extent cx="5943600" cy="2936347"/>
-            <wp:docPr id="8" name="Picture 8"/>
+            <wp:docPr id="13" name="Picture 13"/>
             <wp:cNvGraphicFramePr>
               <a:graphicFrameLocks noChangeAspect="1"/>
             </wp:cNvGraphicFramePr>
@@ -25042,7 +26360,7 @@
                     <pic:cNvPicPr/>
                   </pic:nvPicPr>
                   <pic:blipFill>
-                    <a:blip r:embed="rId16"/>
+                    <a:blip r:embed="rId21"/>
                     <a:stretch>
                       <a:fillRect/>
                     </a:stretch>
@@ -25068,7 +26386,7 @@
           <w:i/>
           <w:sz w:val="20"/>
         </w:rPr>
-        <w:t>Son voilé et sombre, projection réduite. La sourdine cup absorbe les harmoniques aigus, produisant un timbre mat.</w:t>
+        <w:t>F1 monte de 237 à 366 Hz (+54 %). La sourdine cup filtre les graves et propulse l'énergie vers le medium. Son voilé et sombre.</w:t>
       </w:r>
     </w:p>
     <w:p>
@@ -25102,7 +26420,7 @@
         <w:drawing>
           <wp:inline xmlns:a="http://schemas.openxmlformats.org/drawingml/2006/main" xmlns:pic="http://schemas.openxmlformats.org/drawingml/2006/picture">
             <wp:extent cx="5943600" cy="2936347"/>
-            <wp:docPr id="9" name="Picture 9"/>
+            <wp:docPr id="14" name="Picture 14"/>
             <wp:cNvGraphicFramePr>
               <a:graphicFrameLocks noChangeAspect="1"/>
             </wp:cNvGraphicFramePr>
@@ -25114,7 +26432,7 @@
                     <pic:cNvPicPr/>
                   </pic:nvPicPr>
                   <pic:blipFill>
-                    <a:blip r:embed="rId17"/>
+                    <a:blip r:embed="rId22"/>
                     <a:stretch>
                       <a:fillRect/>
                     </a:stretch>
@@ -25140,7 +26458,7 @@
           <w:i/>
           <w:sz w:val="20"/>
         </w:rPr>
-        <w:t>Son nasal et métallique. La sourdine straight comprime le spectre et renforce la zone 800–1 500 Hz.</w:t>
+        <w:t>F1 reste proche à 226 Hz (−5 %). Son nasal et métallique. La sourdine straight comprime le spectre.</w:t>
       </w:r>
     </w:p>
     <w:p>
@@ -25174,7 +26492,7 @@
         <w:drawing>
           <wp:inline xmlns:a="http://schemas.openxmlformats.org/drawingml/2006/main" xmlns:pic="http://schemas.openxmlformats.org/drawingml/2006/picture">
             <wp:extent cx="5943600" cy="2942542"/>
-            <wp:docPr id="10" name="Picture 10"/>
+            <wp:docPr id="15" name="Picture 15"/>
             <wp:cNvGraphicFramePr>
               <a:graphicFrameLocks noChangeAspect="1"/>
             </wp:cNvGraphicFramePr>
@@ -25186,7 +26504,7 @@
                     <pic:cNvPicPr/>
                   </pic:nvPicPr>
                   <pic:blipFill>
-                    <a:blip r:embed="rId18"/>
+                    <a:blip r:embed="rId23"/>
                     <a:stretch>
                       <a:fillRect/>
                     </a:stretch>
@@ -25212,7 +26530,7 @@
           <w:i/>
           <w:sz w:val="20"/>
         </w:rPr>
-        <w:t>Son très concentré, quasi sinusoïdal. F1=162 Hz, timbre jazz intime.</w:t>
+        <w:t>F1 descend à 162 Hz (−32 %). Son très concentré, quasi sinusoïdal. Timbre jazz intime.</w:t>
       </w:r>
     </w:p>
     <w:p>
@@ -25246,7 +26564,7 @@
         <w:drawing>
           <wp:inline xmlns:a="http://schemas.openxmlformats.org/drawingml/2006/main" xmlns:pic="http://schemas.openxmlformats.org/drawingml/2006/picture">
             <wp:extent cx="5943600" cy="2936347"/>
-            <wp:docPr id="11" name="Picture 11"/>
+            <wp:docPr id="16" name="Picture 16"/>
             <wp:cNvGraphicFramePr>
               <a:graphicFrameLocks noChangeAspect="1"/>
             </wp:cNvGraphicFramePr>
@@ -25258,7 +26576,7 @@
                     <pic:cNvPicPr/>
                   </pic:nvPicPr>
                   <pic:blipFill>
-                    <a:blip r:embed="rId19"/>
+                    <a:blip r:embed="rId24"/>
                     <a:stretch>
                       <a:fillRect/>
                     </a:stretch>
@@ -25284,7 +26602,7 @@
           <w:i/>
           <w:sz w:val="20"/>
         </w:rPr>
-        <w:t>Position ouverte : son brillant et nasal. F1=226 Hz, spectre riche.</w:t>
+        <w:t>F1=226 Hz — proche de l'ordinario. Son brillant et nasal.</w:t>
       </w:r>
     </w:p>
     <w:p>
@@ -25318,7 +26636,7 @@
         <w:drawing>
           <wp:inline xmlns:a="http://schemas.openxmlformats.org/drawingml/2006/main" xmlns:pic="http://schemas.openxmlformats.org/drawingml/2006/picture">
             <wp:extent cx="5943600" cy="2936347"/>
-            <wp:docPr id="12" name="Picture 12"/>
+            <wp:docPr id="17" name="Picture 17"/>
             <wp:cNvGraphicFramePr>
               <a:graphicFrameLocks noChangeAspect="1"/>
             </wp:cNvGraphicFramePr>
@@ -25330,7 +26648,7 @@
                     <pic:cNvPicPr/>
                   </pic:nvPicPr>
                   <pic:blipFill>
-                    <a:blip r:embed="rId20"/>
+                    <a:blip r:embed="rId25"/>
                     <a:stretch>
                       <a:fillRect/>
                     </a:stretch>
@@ -25356,7 +26674,7 @@
           <w:i/>
           <w:sz w:val="20"/>
         </w:rPr>
-        <w:t>Position fermée : son très étouffé et nasal. F1 remonte à 398 Hz.</w:t>
+        <w:t>F1 remonte à 398 Hz (+68 %). Son étouffé et nasal.</w:t>
       </w:r>
     </w:p>
     <w:p>
@@ -25368,374 +26686,6 @@
           <w:sz w:val="20"/>
         </w:rPr>
         <w:t>Fp (centroïde) = 1255 Hz</w:t>
-      </w:r>
-    </w:p>
-    <w:p/>
-    <w:p>
-      <w:pPr>
-        <w:pStyle w:val="Heading3"/>
-      </w:pPr>
-      <w:r>
-        <w:t>Trompette avec sourdines</w:t>
-      </w:r>
-    </w:p>
-    <w:p>
-      <w:pPr>
-        <w:pStyle w:val="Heading2"/>
-      </w:pPr>
-      <w:r>
-        <w:rPr>
-          <w:color w:val="B71C1C"/>
-        </w:rPr>
-        <w:t>Trompette + sourd. cup</w:t>
-      </w:r>
-    </w:p>
-    <w:p>
-      <w:pPr>
-        <w:jc w:val="center"/>
-      </w:pPr>
-      <w:r>
-        <w:drawing>
-          <wp:inline xmlns:a="http://schemas.openxmlformats.org/drawingml/2006/main" xmlns:pic="http://schemas.openxmlformats.org/drawingml/2006/picture">
-            <wp:extent cx="5943600" cy="2948763"/>
-            <wp:docPr id="13" name="Picture 13"/>
-            <wp:cNvGraphicFramePr>
-              <a:graphicFrameLocks noChangeAspect="1"/>
-            </wp:cNvGraphicFramePr>
-            <a:graphic>
-              <a:graphicData uri="http://schemas.openxmlformats.org/drawingml/2006/picture">
-                <pic:pic>
-                  <pic:nvPicPr>
-                    <pic:cNvPr id="0" name="cuivres_tpt_cup.png"/>
-                    <pic:cNvPicPr/>
-                  </pic:nvPicPr>
-                  <pic:blipFill>
-                    <a:blip r:embed="rId21"/>
-                    <a:stretch>
-                      <a:fillRect/>
-                    </a:stretch>
-                  </pic:blipFill>
-                  <pic:spPr>
-                    <a:xfrm>
-                      <a:off x="0" y="0"/>
-                      <a:ext cx="5943600" cy="2948763"/>
-                    </a:xfrm>
-                    <a:prstGeom prst="rect"/>
-                  </pic:spPr>
-                </pic:pic>
-              </a:graphicData>
-            </a:graphic>
-          </wp:inline>
-        </w:drawing>
-      </w:r>
-    </w:p>
-    <w:p>
-      <w:r>
-        <w:rPr>
-          <w:b w:val="0"/>
-          <w:i/>
-          <w:sz w:val="20"/>
-        </w:rPr>
-        <w:t>Son doux et arrondi, perd la brillance caractéristique. Timbre proche du bugle.</w:t>
-      </w:r>
-    </w:p>
-    <w:p>
-      <w:r>
-        <w:rPr>
-          <w:b/>
-          <w:i w:val="0"/>
-          <w:color w:val="1B5E20"/>
-          <w:sz w:val="20"/>
-        </w:rPr>
-        <w:t>Fp (centroïde) = 1260 Hz</w:t>
-      </w:r>
-    </w:p>
-    <w:p/>
-    <w:p>
-      <w:pPr>
-        <w:pStyle w:val="Heading2"/>
-      </w:pPr>
-      <w:r>
-        <w:rPr>
-          <w:color w:val="B71C1C"/>
-        </w:rPr>
-        <w:t>Trompette + sourd. sèche</w:t>
-      </w:r>
-    </w:p>
-    <w:p>
-      <w:pPr>
-        <w:jc w:val="center"/>
-      </w:pPr>
-      <w:r>
-        <w:drawing>
-          <wp:inline xmlns:a="http://schemas.openxmlformats.org/drawingml/2006/main" xmlns:pic="http://schemas.openxmlformats.org/drawingml/2006/picture">
-            <wp:extent cx="5943600" cy="2944613"/>
-            <wp:docPr id="14" name="Picture 14"/>
-            <wp:cNvGraphicFramePr>
-              <a:graphicFrameLocks noChangeAspect="1"/>
-            </wp:cNvGraphicFramePr>
-            <a:graphic>
-              <a:graphicData uri="http://schemas.openxmlformats.org/drawingml/2006/picture">
-                <pic:pic>
-                  <pic:nvPicPr>
-                    <pic:cNvPr id="0" name="cuivres_tpt_straight.png"/>
-                    <pic:cNvPicPr/>
-                  </pic:nvPicPr>
-                  <pic:blipFill>
-                    <a:blip r:embed="rId22"/>
-                    <a:stretch>
-                      <a:fillRect/>
-                    </a:stretch>
-                  </pic:blipFill>
-                  <pic:spPr>
-                    <a:xfrm>
-                      <a:off x="0" y="0"/>
-                      <a:ext cx="5943600" cy="2944613"/>
-                    </a:xfrm>
-                    <a:prstGeom prst="rect"/>
-                  </pic:spPr>
-                </pic:pic>
-              </a:graphicData>
-            </a:graphic>
-          </wp:inline>
-        </w:drawing>
-      </w:r>
-    </w:p>
-    <w:p>
-      <w:r>
-        <w:rPr>
-          <w:b w:val="0"/>
-          <w:i/>
-          <w:sz w:val="20"/>
-        </w:rPr>
-        <w:t>Son piquant et nasal, le plus utilisé en orchestre. Caractère pointu et projeté.</w:t>
-      </w:r>
-    </w:p>
-    <w:p>
-      <w:r>
-        <w:rPr>
-          <w:b/>
-          <w:i w:val="0"/>
-          <w:color w:val="1B5E20"/>
-          <w:sz w:val="20"/>
-        </w:rPr>
-        <w:t>Fp (centroïde) = 1084 Hz</w:t>
-      </w:r>
-    </w:p>
-    <w:p/>
-    <w:p>
-      <w:pPr>
-        <w:pStyle w:val="Heading2"/>
-      </w:pPr>
-      <w:r>
-        <w:rPr>
-          <w:color w:val="B71C1C"/>
-        </w:rPr>
-        <w:t>Trompette + sourd. harmon</w:t>
-      </w:r>
-    </w:p>
-    <w:p>
-      <w:pPr>
-        <w:jc w:val="center"/>
-      </w:pPr>
-      <w:r>
-        <w:drawing>
-          <wp:inline xmlns:a="http://schemas.openxmlformats.org/drawingml/2006/main" xmlns:pic="http://schemas.openxmlformats.org/drawingml/2006/picture">
-            <wp:extent cx="5943600" cy="2938409"/>
-            <wp:docPr id="15" name="Picture 15"/>
-            <wp:cNvGraphicFramePr>
-              <a:graphicFrameLocks noChangeAspect="1"/>
-            </wp:cNvGraphicFramePr>
-            <a:graphic>
-              <a:graphicData uri="http://schemas.openxmlformats.org/drawingml/2006/picture">
-                <pic:pic>
-                  <pic:nvPicPr>
-                    <pic:cNvPr id="0" name="cuivres_tpt_harmon.png"/>
-                    <pic:cNvPicPr/>
-                  </pic:nvPicPr>
-                  <pic:blipFill>
-                    <a:blip r:embed="rId23"/>
-                    <a:stretch>
-                      <a:fillRect/>
-                    </a:stretch>
-                  </pic:blipFill>
-                  <pic:spPr>
-                    <a:xfrm>
-                      <a:off x="0" y="0"/>
-                      <a:ext cx="5943600" cy="2938409"/>
-                    </a:xfrm>
-                    <a:prstGeom prst="rect"/>
-                  </pic:spPr>
-                </pic:pic>
-              </a:graphicData>
-            </a:graphic>
-          </wp:inline>
-        </w:drawing>
-      </w:r>
-    </w:p>
-    <w:p>
-      <w:r>
-        <w:rPr>
-          <w:b w:val="0"/>
-          <w:i/>
-          <w:sz w:val="20"/>
-        </w:rPr>
-        <w:t>Son miles-davisien. F1=2 358 Hz — tout le spectre propulsé dans la zone /i/, brillance extrême.</w:t>
-      </w:r>
-    </w:p>
-    <w:p>
-      <w:r>
-        <w:rPr>
-          <w:b/>
-          <w:i w:val="0"/>
-          <w:color w:val="1B5E20"/>
-          <w:sz w:val="20"/>
-        </w:rPr>
-        <w:t>Fp (centroïde) = 1443 Hz</w:t>
-      </w:r>
-    </w:p>
-    <w:p/>
-    <w:p>
-      <w:pPr>
-        <w:pStyle w:val="Heading2"/>
-      </w:pPr>
-      <w:r>
-        <w:rPr>
-          <w:color w:val="B71C1C"/>
-        </w:rPr>
-        <w:t>Trompette + sourd. wah (ouvert)</w:t>
-      </w:r>
-    </w:p>
-    <w:p>
-      <w:pPr>
-        <w:jc w:val="center"/>
-      </w:pPr>
-      <w:r>
-        <w:drawing>
-          <wp:inline xmlns:a="http://schemas.openxmlformats.org/drawingml/2006/main" xmlns:pic="http://schemas.openxmlformats.org/drawingml/2006/picture">
-            <wp:extent cx="5943600" cy="2936347"/>
-            <wp:docPr id="16" name="Picture 16"/>
-            <wp:cNvGraphicFramePr>
-              <a:graphicFrameLocks noChangeAspect="1"/>
-            </wp:cNvGraphicFramePr>
-            <a:graphic>
-              <a:graphicData uri="http://schemas.openxmlformats.org/drawingml/2006/picture">
-                <pic:pic>
-                  <pic:nvPicPr>
-                    <pic:cNvPr id="0" name="cuivres_tpt_wah_open.png"/>
-                    <pic:cNvPicPr/>
-                  </pic:nvPicPr>
-                  <pic:blipFill>
-                    <a:blip r:embed="rId24"/>
-                    <a:stretch>
-                      <a:fillRect/>
-                    </a:stretch>
-                  </pic:blipFill>
-                  <pic:spPr>
-                    <a:xfrm>
-                      <a:off x="0" y="0"/>
-                      <a:ext cx="5943600" cy="2936347"/>
-                    </a:xfrm>
-                    <a:prstGeom prst="rect"/>
-                  </pic:spPr>
-                </pic:pic>
-              </a:graphicData>
-            </a:graphic>
-          </wp:inline>
-        </w:drawing>
-      </w:r>
-    </w:p>
-    <w:p>
-      <w:r>
-        <w:rPr>
-          <w:b w:val="0"/>
-          <w:i/>
-          <w:sz w:val="20"/>
-        </w:rPr>
-        <w:t>Tige insérée, position ouverte : son nasal et brillant.</w:t>
-      </w:r>
-    </w:p>
-    <w:p>
-      <w:r>
-        <w:rPr>
-          <w:b/>
-          <w:i w:val="0"/>
-          <w:color w:val="1B5E20"/>
-          <w:sz w:val="20"/>
-        </w:rPr>
-        <w:t>Fp (centroïde) = 916 Hz</w:t>
-      </w:r>
-    </w:p>
-    <w:p/>
-    <w:p>
-      <w:pPr>
-        <w:pStyle w:val="Heading2"/>
-      </w:pPr>
-      <w:r>
-        <w:rPr>
-          <w:color w:val="B71C1C"/>
-        </w:rPr>
-        <w:t>Trompette + sourd. wah (fermé)</w:t>
-      </w:r>
-    </w:p>
-    <w:p>
-      <w:pPr>
-        <w:jc w:val="center"/>
-      </w:pPr>
-      <w:r>
-        <w:drawing>
-          <wp:inline xmlns:a="http://schemas.openxmlformats.org/drawingml/2006/main" xmlns:pic="http://schemas.openxmlformats.org/drawingml/2006/picture">
-            <wp:extent cx="5943600" cy="2948763"/>
-            <wp:docPr id="17" name="Picture 17"/>
-            <wp:cNvGraphicFramePr>
-              <a:graphicFrameLocks noChangeAspect="1"/>
-            </wp:cNvGraphicFramePr>
-            <a:graphic>
-              <a:graphicData uri="http://schemas.openxmlformats.org/drawingml/2006/picture">
-                <pic:pic>
-                  <pic:nvPicPr>
-                    <pic:cNvPr id="0" name="cuivres_tpt_wah_closed.png"/>
-                    <pic:cNvPicPr/>
-                  </pic:nvPicPr>
-                  <pic:blipFill>
-                    <a:blip r:embed="rId25"/>
-                    <a:stretch>
-                      <a:fillRect/>
-                    </a:stretch>
-                  </pic:blipFill>
-                  <pic:spPr>
-                    <a:xfrm>
-                      <a:off x="0" y="0"/>
-                      <a:ext cx="5943600" cy="2948763"/>
-                    </a:xfrm>
-                    <a:prstGeom prst="rect"/>
-                  </pic:spPr>
-                </pic:pic>
-              </a:graphicData>
-            </a:graphic>
-          </wp:inline>
-        </w:drawing>
-      </w:r>
-    </w:p>
-    <w:p>
-      <w:r>
-        <w:rPr>
-          <w:b w:val="0"/>
-          <w:i/>
-          <w:sz w:val="20"/>
-        </w:rPr>
-        <w:t>Tige insérée, position fermée : son très étouffé. Spectre fortement filtré.</w:t>
-      </w:r>
-    </w:p>
-    <w:p>
-      <w:r>
-        <w:rPr>
-          <w:b/>
-          <w:i w:val="0"/>
-          <w:color w:val="1B5E20"/>
-          <w:sz w:val="20"/>
-        </w:rPr>
-        <w:t>Fp (centroïde) = 935 Hz</w:t>
       </w:r>
     </w:p>
     <w:p/>
@@ -25804,7 +26754,7 @@
           <w:i/>
           <w:sz w:val="20"/>
         </w:rPr>
-        <w:t>Son assourdi et compact. F1 reste à 249 Hz, projection réduite.</w:t>
+        <w:t>F1 reste à 226 Hz (Δ=0 Hz). Projection réduite, son assourdi.</w:t>
       </w:r>
     </w:p>
     <w:p>

</xml_diff>